<commit_message>
servicios esta casi terminado me queda el modificar
</commit_message>
<xml_diff>
--- a/documentacion/Diccionario_de_Datos_Trabajo_Final_7_Completo (1).docx
+++ b/documentacion/Diccionario_de_Datos_Trabajo_Final_7_Completo (1).docx
@@ -1188,13 +1188,21 @@
       </w:pPr>
       <w:r>
         <w:rPr>
-          <w:rFonts w:ascii="times new roman" w:hAnsi="times new roman"/>
+          <w:rFonts w:eastAsia="Calibri" w:cs="Calibri"/>
+          <w:color w:val="17365D"/>
+          <w:spacing w:val="5"/>
+          <w:sz w:val="52"/>
+          <w:shd w:fill="auto" w:val="clear"/>
         </w:rPr>
       </w:r>
     </w:p>
     <w:p>
       <w:pPr>
         <w:pStyle w:val="Heading1"/>
+        <w:numPr>
+          <w:ilvl w:val="0"/>
+          <w:numId w:val="1"/>
+        </w:numPr>
         <w:ind w:hanging="0" w:left="0"/>
         <w:jc w:val="center"/>
         <w:rPr>
@@ -1217,7 +1225,9 @@
         </w:rPr>
       </w:pPr>
       <w:r>
-        <w:rPr/>
+        <w:rPr>
+          <w:rFonts w:ascii="times new roman" w:hAnsi="times new roman"/>
+        </w:rPr>
       </w:r>
     </w:p>
     <w:p>
@@ -1229,7 +1239,54 @@
         </w:rPr>
       </w:pPr>
       <w:r>
-        <w:rPr/>
+        <w:rPr>
+          <w:rFonts w:ascii="times new roman" w:hAnsi="times new roman"/>
+        </w:rPr>
+        <w:drawing>
+          <wp:anchor behindDoc="0" distT="0" distB="0" distL="0" distR="0" simplePos="0" locked="0" layoutInCell="0" allowOverlap="1" relativeHeight="3">
+            <wp:simplePos x="0" y="0"/>
+            <wp:positionH relativeFrom="column">
+              <wp:align>center</wp:align>
+            </wp:positionH>
+            <wp:positionV relativeFrom="paragraph">
+              <wp:posOffset>635</wp:posOffset>
+            </wp:positionV>
+            <wp:extent cx="5943600" cy="2343785"/>
+            <wp:effectExtent l="0" t="0" r="0" b="0"/>
+            <wp:wrapSquare wrapText="largest"/>
+            <wp:docPr id="2" name="Imagen2" descr=""/>
+            <wp:cNvGraphicFramePr>
+              <a:graphicFrameLocks xmlns:a="http://schemas.openxmlformats.org/drawingml/2006/main" noChangeAspect="1"/>
+            </wp:cNvGraphicFramePr>
+            <a:graphic xmlns:a="http://schemas.openxmlformats.org/drawingml/2006/main">
+              <a:graphicData uri="http://schemas.openxmlformats.org/drawingml/2006/picture">
+                <pic:pic xmlns:pic="http://schemas.openxmlformats.org/drawingml/2006/picture">
+                  <pic:nvPicPr>
+                    <pic:cNvPr id="2" name="Imagen2" descr=""/>
+                    <pic:cNvPicPr>
+                      <a:picLocks noChangeAspect="1" noChangeArrowheads="1"/>
+                    </pic:cNvPicPr>
+                  </pic:nvPicPr>
+                  <pic:blipFill>
+                    <a:blip r:embed="rId3"/>
+                    <a:stretch>
+                      <a:fillRect/>
+                    </a:stretch>
+                  </pic:blipFill>
+                  <pic:spPr bwMode="auto">
+                    <a:xfrm>
+                      <a:off x="0" y="0"/>
+                      <a:ext cx="5943600" cy="2343785"/>
+                    </a:xfrm>
+                    <a:prstGeom prst="rect">
+                      <a:avLst/>
+                    </a:prstGeom>
+                  </pic:spPr>
+                </pic:pic>
+              </a:graphicData>
+            </a:graphic>
+          </wp:anchor>
+        </w:drawing>
       </w:r>
     </w:p>
     <w:p>
@@ -1241,12 +1298,2929 @@
         </w:rPr>
       </w:pPr>
       <w:r>
-        <w:rPr/>
+        <w:rPr>
+          <w:rFonts w:ascii="times new roman" w:hAnsi="times new roman"/>
+        </w:rPr>
+      </w:r>
+    </w:p>
+    <w:p>
+      <w:pPr>
+        <w:pStyle w:val="BodyText"/>
+        <w:jc w:val="center"/>
+        <w:rPr>
+          <w:rFonts w:ascii="times new roman" w:hAnsi="times new roman"/>
+        </w:rPr>
+      </w:pPr>
+      <w:r>
+        <w:rPr>
+          <w:rFonts w:ascii="times new roman" w:hAnsi="times new roman"/>
+        </w:rPr>
+      </w:r>
+    </w:p>
+    <w:p>
+      <w:pPr>
+        <w:pStyle w:val="BodyText"/>
+        <w:jc w:val="center"/>
+        <w:rPr>
+          <w:rFonts w:ascii="times new roman" w:hAnsi="times new roman"/>
+        </w:rPr>
+      </w:pPr>
+      <w:r>
+        <w:rPr>
+          <w:rFonts w:ascii="times new roman" w:hAnsi="times new roman"/>
+        </w:rPr>
+      </w:r>
+    </w:p>
+    <w:p>
+      <w:pPr>
+        <w:pStyle w:val="BodyText"/>
+        <w:jc w:val="center"/>
+        <w:rPr>
+          <w:rFonts w:ascii="times new roman" w:hAnsi="times new roman"/>
+        </w:rPr>
+      </w:pPr>
+      <w:r>
+        <w:rPr>
+          <w:rFonts w:ascii="times new roman" w:hAnsi="times new roman"/>
+        </w:rPr>
+      </w:r>
+    </w:p>
+    <w:p>
+      <w:pPr>
+        <w:pStyle w:val="BodyText"/>
+        <w:jc w:val="center"/>
+        <w:rPr>
+          <w:rFonts w:ascii="times new roman" w:hAnsi="times new roman"/>
+        </w:rPr>
+      </w:pPr>
+      <w:r>
+        <w:rPr>
+          <w:rFonts w:ascii="times new roman" w:hAnsi="times new roman"/>
+        </w:rPr>
+      </w:r>
+    </w:p>
+    <w:p>
+      <w:pPr>
+        <w:pStyle w:val="BodyText"/>
+        <w:jc w:val="center"/>
+        <w:rPr>
+          <w:rFonts w:ascii="times new roman" w:hAnsi="times new roman"/>
+        </w:rPr>
+      </w:pPr>
+      <w:r>
+        <w:rPr>
+          <w:rFonts w:ascii="times new roman" w:hAnsi="times new roman"/>
+        </w:rPr>
+      </w:r>
+    </w:p>
+    <w:p>
+      <w:pPr>
+        <w:pStyle w:val="BodyText"/>
+        <w:jc w:val="center"/>
+        <w:rPr>
+          <w:rFonts w:ascii="times new roman" w:hAnsi="times new roman"/>
+        </w:rPr>
+      </w:pPr>
+      <w:r>
+        <w:rPr>
+          <w:rFonts w:ascii="times new roman" w:hAnsi="times new roman"/>
+        </w:rPr>
+      </w:r>
+    </w:p>
+    <w:p>
+      <w:pPr>
+        <w:pStyle w:val="BodyText"/>
+        <w:jc w:val="center"/>
+        <w:rPr>
+          <w:rFonts w:ascii="times new roman" w:hAnsi="times new roman"/>
+        </w:rPr>
+      </w:pPr>
+      <w:r>
+        <w:rPr>
+          <w:rFonts w:ascii="times new roman" w:hAnsi="times new roman"/>
+        </w:rPr>
+      </w:r>
+    </w:p>
+    <w:p>
+      <w:pPr>
+        <w:pStyle w:val="BodyText"/>
+        <w:jc w:val="center"/>
+        <w:rPr>
+          <w:rFonts w:ascii="times new roman" w:hAnsi="times new roman"/>
+        </w:rPr>
+      </w:pPr>
+      <w:r>
+        <w:rPr>
+          <w:rFonts w:ascii="times new roman" w:hAnsi="times new roman"/>
+        </w:rPr>
+      </w:r>
+    </w:p>
+    <w:p>
+      <w:pPr>
+        <w:pStyle w:val="BodyText"/>
+        <w:jc w:val="center"/>
+        <w:rPr>
+          <w:rFonts w:ascii="times new roman" w:hAnsi="times new roman"/>
+        </w:rPr>
+      </w:pPr>
+      <w:r>
+        <w:rPr>
+          <w:rFonts w:ascii="times new roman" w:hAnsi="times new roman"/>
+        </w:rPr>
+      </w:r>
+    </w:p>
+    <w:p>
+      <w:pPr>
+        <w:pStyle w:val="BodyText"/>
+        <w:jc w:val="center"/>
+        <w:rPr>
+          <w:rFonts w:ascii="times new roman" w:hAnsi="times new roman"/>
+        </w:rPr>
+      </w:pPr>
+      <w:r>
+        <w:rPr>
+          <w:rFonts w:ascii="times new roman" w:hAnsi="times new roman"/>
+        </w:rPr>
+      </w:r>
+    </w:p>
+    <w:p>
+      <w:pPr>
+        <w:pStyle w:val="BodyText"/>
+        <w:jc w:val="center"/>
+        <w:rPr>
+          <w:rFonts w:ascii="times new roman" w:hAnsi="times new roman"/>
+        </w:rPr>
+      </w:pPr>
+      <w:r>
+        <w:rPr>
+          <w:rFonts w:ascii="times new roman" w:hAnsi="times new roman"/>
+        </w:rPr>
+      </w:r>
+    </w:p>
+    <w:p>
+      <w:pPr>
+        <w:pStyle w:val="BodyText"/>
+        <w:jc w:val="center"/>
+        <w:rPr>
+          <w:rFonts w:ascii="times new roman" w:hAnsi="times new roman"/>
+        </w:rPr>
+      </w:pPr>
+      <w:r>
+        <w:rPr>
+          <w:rFonts w:ascii="times new roman" w:hAnsi="times new roman"/>
+        </w:rPr>
+      </w:r>
+    </w:p>
+    <w:p>
+      <w:pPr>
+        <w:pStyle w:val="BodyText"/>
+        <w:jc w:val="center"/>
+        <w:rPr>
+          <w:rFonts w:ascii="times new roman" w:hAnsi="times new roman"/>
+        </w:rPr>
+      </w:pPr>
+      <w:r>
+        <w:rPr>
+          <w:rFonts w:ascii="times new roman" w:hAnsi="times new roman"/>
+        </w:rPr>
+      </w:r>
+    </w:p>
+    <w:p>
+      <w:pPr>
+        <w:pStyle w:val="BodyText"/>
+        <w:jc w:val="center"/>
+        <w:rPr>
+          <w:rFonts w:ascii="times new roman" w:hAnsi="times new roman"/>
+        </w:rPr>
+      </w:pPr>
+      <w:r>
+        <w:rPr>
+          <w:rFonts w:ascii="times new roman" w:hAnsi="times new roman"/>
+        </w:rPr>
+      </w:r>
+    </w:p>
+    <w:p>
+      <w:pPr>
+        <w:pStyle w:val="BodyText"/>
+        <w:jc w:val="center"/>
+        <w:rPr>
+          <w:rFonts w:ascii="times new roman" w:hAnsi="times new roman"/>
+        </w:rPr>
+      </w:pPr>
+      <w:r>
+        <w:rPr>
+          <w:rFonts w:ascii="times new roman" w:hAnsi="times new roman"/>
+        </w:rPr>
+      </w:r>
+    </w:p>
+    <w:p>
+      <w:pPr>
+        <w:pStyle w:val="BodyText"/>
+        <w:jc w:val="center"/>
+        <w:rPr>
+          <w:rFonts w:ascii="times new roman" w:hAnsi="times new roman"/>
+        </w:rPr>
+      </w:pPr>
+      <w:r>
+        <w:rPr>
+          <w:rFonts w:ascii="times new roman" w:hAnsi="times new roman"/>
+        </w:rPr>
+      </w:r>
+    </w:p>
+    <w:p>
+      <w:pPr>
+        <w:pStyle w:val="BodyText"/>
+        <w:jc w:val="center"/>
+        <w:rPr>
+          <w:rFonts w:ascii="times new roman" w:hAnsi="times new roman"/>
+        </w:rPr>
+      </w:pPr>
+      <w:r>
+        <w:rPr>
+          <w:rFonts w:ascii="times new roman" w:hAnsi="times new roman"/>
+        </w:rPr>
+      </w:r>
+    </w:p>
+    <w:p>
+      <w:pPr>
+        <w:pStyle w:val="BodyText"/>
+        <w:jc w:val="center"/>
+        <w:rPr>
+          <w:rFonts w:ascii="times new roman" w:hAnsi="times new roman"/>
+          <w:sz w:val="28"/>
+          <w:szCs w:val="28"/>
+        </w:rPr>
+      </w:pPr>
+      <w:r>
+        <w:rPr>
+          <w:rFonts w:ascii="times new roman" w:hAnsi="times new roman"/>
+          <w:sz w:val="28"/>
+          <w:szCs w:val="28"/>
+        </w:rPr>
+        <w:t>Analisis Del Problema</w:t>
+      </w:r>
+    </w:p>
+    <w:p>
+      <w:pPr>
+        <w:pStyle w:val="BodyText"/>
+        <w:jc w:val="center"/>
+        <w:rPr>
+          <w:rFonts w:ascii="times new roman" w:hAnsi="times new roman"/>
+          <w:sz w:val="28"/>
+          <w:szCs w:val="28"/>
+        </w:rPr>
+      </w:pPr>
+      <w:r>
+        <w:rPr>
+          <w:rFonts w:ascii="times new roman" w:hAnsi="times new roman"/>
+          <w:sz w:val="28"/>
+          <w:szCs w:val="28"/>
+        </w:rPr>
+      </w:r>
+    </w:p>
+    <w:tbl>
+      <w:tblPr>
+        <w:tblW w:w="5000" w:type="pct"/>
+        <w:jc w:val="left"/>
+        <w:tblInd w:w="55" w:type="dxa"/>
+        <w:tblLayout w:type="fixed"/>
+        <w:tblCellMar>
+          <w:top w:w="55" w:type="dxa"/>
+          <w:left w:w="55" w:type="dxa"/>
+          <w:bottom w:w="55" w:type="dxa"/>
+          <w:right w:w="55" w:type="dxa"/>
+        </w:tblCellMar>
+      </w:tblPr>
+      <w:tblGrid>
+        <w:gridCol w:w="4679"/>
+        <w:gridCol w:w="4680"/>
+      </w:tblGrid>
+      <w:tr>
+        <w:trPr/>
+        <w:tc>
+          <w:tcPr>
+            <w:tcW w:w="4679" w:type="dxa"/>
+            <w:tcBorders>
+              <w:top w:val="single" w:sz="4" w:space="0" w:color="000000"/>
+              <w:left w:val="single" w:sz="4" w:space="0" w:color="000000"/>
+              <w:bottom w:val="single" w:sz="4" w:space="0" w:color="000000"/>
+            </w:tcBorders>
+          </w:tcPr>
+          <w:p>
+            <w:pPr>
+              <w:pStyle w:val="Contenidodelatabla"/>
+              <w:jc w:val="left"/>
+              <w:rPr>
+                <w:rFonts w:ascii="Liberation Serif" w:hAnsi="Liberation Serif"/>
+                <w:b w:val="false"/>
+                <w:bCs w:val="false"/>
+                <w:i w:val="false"/>
+                <w:i w:val="false"/>
+                <w:iCs w:val="false"/>
+                <w:strike w:val="false"/>
+                <w:dstrike w:val="false"/>
+                <w:outline w:val="false"/>
+                <w:shadow w:val="false"/>
+                <w:color w:val="000000"/>
+                <w:sz w:val="24"/>
+                <w:szCs w:val="24"/>
+                <w:u w:val="none"/>
+              </w:rPr>
+            </w:pPr>
+            <w:r>
+              <w:rPr>
+                <w:rFonts w:ascii="Liberation Serif" w:hAnsi="Liberation Serif"/>
+                <w:b w:val="false"/>
+                <w:bCs w:val="false"/>
+                <w:i w:val="false"/>
+                <w:iCs w:val="false"/>
+                <w:strike w:val="false"/>
+                <w:dstrike w:val="false"/>
+                <w:outline w:val="false"/>
+                <w:shadow w:val="false"/>
+                <w:color w:val="000000"/>
+                <w:sz w:val="24"/>
+                <w:szCs w:val="24"/>
+                <w:u w:val="none"/>
+              </w:rPr>
+              <w:t>Cliente:</w:t>
+            </w:r>
+          </w:p>
+        </w:tc>
+        <w:tc>
+          <w:tcPr>
+            <w:tcW w:w="4680" w:type="dxa"/>
+            <w:tcBorders>
+              <w:top w:val="single" w:sz="4" w:space="0" w:color="000000"/>
+              <w:left w:val="single" w:sz="4" w:space="0" w:color="000000"/>
+              <w:bottom w:val="single" w:sz="4" w:space="0" w:color="000000"/>
+              <w:right w:val="single" w:sz="4" w:space="0" w:color="000000"/>
+            </w:tcBorders>
+          </w:tcPr>
+          <w:p>
+            <w:pPr>
+              <w:pStyle w:val="Contenidodelatabla"/>
+              <w:jc w:val="left"/>
+              <w:rPr>
+                <w:rFonts w:ascii="Liberation Serif" w:hAnsi="Liberation Serif"/>
+                <w:b w:val="false"/>
+                <w:bCs w:val="false"/>
+                <w:i w:val="false"/>
+                <w:i w:val="false"/>
+                <w:iCs w:val="false"/>
+                <w:strike w:val="false"/>
+                <w:dstrike w:val="false"/>
+                <w:outline w:val="false"/>
+                <w:shadow w:val="false"/>
+                <w:color w:val="000000"/>
+                <w:sz w:val="24"/>
+                <w:szCs w:val="24"/>
+                <w:u w:val="none"/>
+              </w:rPr>
+            </w:pPr>
+            <w:r>
+              <w:rPr>
+                <w:rFonts w:ascii="Liberation Serif" w:hAnsi="Liberation Serif"/>
+                <w:b w:val="false"/>
+                <w:bCs w:val="false"/>
+                <w:i w:val="false"/>
+                <w:iCs w:val="false"/>
+                <w:strike w:val="false"/>
+                <w:dstrike w:val="false"/>
+                <w:outline w:val="false"/>
+                <w:shadow w:val="false"/>
+                <w:color w:val="000000"/>
+                <w:sz w:val="24"/>
+                <w:szCs w:val="24"/>
+                <w:u w:val="none"/>
+              </w:rPr>
+              <w:t>Salon de Belleza</w:t>
+            </w:r>
+          </w:p>
+        </w:tc>
+      </w:tr>
+      <w:tr>
+        <w:trPr/>
+        <w:tc>
+          <w:tcPr>
+            <w:tcW w:w="4679" w:type="dxa"/>
+            <w:tcBorders>
+              <w:left w:val="single" w:sz="4" w:space="0" w:color="000000"/>
+              <w:bottom w:val="single" w:sz="4" w:space="0" w:color="000000"/>
+            </w:tcBorders>
+          </w:tcPr>
+          <w:p>
+            <w:pPr>
+              <w:pStyle w:val="Contenidodelatabla"/>
+              <w:jc w:val="left"/>
+              <w:rPr>
+                <w:rFonts w:ascii="Liberation Serif" w:hAnsi="Liberation Serif"/>
+                <w:b w:val="false"/>
+                <w:bCs w:val="false"/>
+                <w:i w:val="false"/>
+                <w:i w:val="false"/>
+                <w:iCs w:val="false"/>
+                <w:strike w:val="false"/>
+                <w:dstrike w:val="false"/>
+                <w:outline w:val="false"/>
+                <w:shadow w:val="false"/>
+                <w:color w:val="000000"/>
+                <w:sz w:val="24"/>
+                <w:szCs w:val="24"/>
+                <w:u w:val="none"/>
+              </w:rPr>
+            </w:pPr>
+            <w:r>
+              <w:rPr>
+                <w:rFonts w:ascii="Liberation Serif" w:hAnsi="Liberation Serif"/>
+                <w:b w:val="false"/>
+                <w:bCs w:val="false"/>
+                <w:i w:val="false"/>
+                <w:iCs w:val="false"/>
+                <w:strike w:val="false"/>
+                <w:dstrike w:val="false"/>
+                <w:outline w:val="false"/>
+                <w:shadow w:val="false"/>
+                <w:color w:val="000000"/>
+                <w:sz w:val="24"/>
+                <w:szCs w:val="24"/>
+                <w:u w:val="none"/>
+              </w:rPr>
+              <w:t>Usuarios:</w:t>
+            </w:r>
+          </w:p>
+        </w:tc>
+        <w:tc>
+          <w:tcPr>
+            <w:tcW w:w="4680" w:type="dxa"/>
+            <w:tcBorders>
+              <w:left w:val="single" w:sz="4" w:space="0" w:color="000000"/>
+              <w:bottom w:val="single" w:sz="4" w:space="0" w:color="000000"/>
+              <w:right w:val="single" w:sz="4" w:space="0" w:color="000000"/>
+            </w:tcBorders>
+          </w:tcPr>
+          <w:p>
+            <w:pPr>
+              <w:pStyle w:val="Contenidodelatabla"/>
+              <w:jc w:val="left"/>
+              <w:rPr>
+                <w:rFonts w:ascii="Liberation Serif" w:hAnsi="Liberation Serif"/>
+                <w:b w:val="false"/>
+                <w:bCs w:val="false"/>
+                <w:i w:val="false"/>
+                <w:i w:val="false"/>
+                <w:iCs w:val="false"/>
+                <w:strike w:val="false"/>
+                <w:dstrike w:val="false"/>
+                <w:outline w:val="false"/>
+                <w:shadow w:val="false"/>
+                <w:color w:val="000000"/>
+                <w:sz w:val="24"/>
+                <w:szCs w:val="24"/>
+                <w:u w:val="none"/>
+              </w:rPr>
+            </w:pPr>
+            <w:r>
+              <w:rPr>
+                <w:rFonts w:ascii="Liberation Serif" w:hAnsi="Liberation Serif"/>
+                <w:b w:val="false"/>
+                <w:bCs w:val="false"/>
+                <w:i w:val="false"/>
+                <w:iCs w:val="false"/>
+                <w:strike w:val="false"/>
+                <w:dstrike w:val="false"/>
+                <w:outline w:val="false"/>
+                <w:shadow w:val="false"/>
+                <w:color w:val="000000"/>
+                <w:sz w:val="24"/>
+                <w:szCs w:val="24"/>
+                <w:u w:val="none"/>
+              </w:rPr>
+              <w:t>Personal administrativo</w:t>
+            </w:r>
+          </w:p>
+        </w:tc>
+      </w:tr>
+      <w:tr>
+        <w:trPr/>
+        <w:tc>
+          <w:tcPr>
+            <w:tcW w:w="4679" w:type="dxa"/>
+            <w:tcBorders>
+              <w:left w:val="single" w:sz="4" w:space="0" w:color="000000"/>
+              <w:bottom w:val="single" w:sz="4" w:space="0" w:color="000000"/>
+            </w:tcBorders>
+          </w:tcPr>
+          <w:p>
+            <w:pPr>
+              <w:pStyle w:val="Contenidodelatabla"/>
+              <w:jc w:val="left"/>
+              <w:rPr>
+                <w:rFonts w:ascii="Liberation Serif" w:hAnsi="Liberation Serif"/>
+                <w:b w:val="false"/>
+                <w:bCs w:val="false"/>
+                <w:i w:val="false"/>
+                <w:i w:val="false"/>
+                <w:iCs w:val="false"/>
+                <w:strike w:val="false"/>
+                <w:dstrike w:val="false"/>
+                <w:outline w:val="false"/>
+                <w:shadow w:val="false"/>
+                <w:color w:val="000000"/>
+                <w:sz w:val="24"/>
+                <w:szCs w:val="24"/>
+                <w:u w:val="none"/>
+              </w:rPr>
+            </w:pPr>
+            <w:r>
+              <w:rPr>
+                <w:rFonts w:ascii="Liberation Serif" w:hAnsi="Liberation Serif"/>
+                <w:b w:val="false"/>
+                <w:bCs w:val="false"/>
+                <w:i w:val="false"/>
+                <w:iCs w:val="false"/>
+                <w:strike w:val="false"/>
+                <w:dstrike w:val="false"/>
+                <w:outline w:val="false"/>
+                <w:shadow w:val="false"/>
+                <w:color w:val="000000"/>
+                <w:sz w:val="24"/>
+                <w:szCs w:val="24"/>
+                <w:u w:val="none"/>
+              </w:rPr>
+              <w:t>Requerimientos Funcionales:</w:t>
+            </w:r>
+          </w:p>
+        </w:tc>
+        <w:tc>
+          <w:tcPr>
+            <w:tcW w:w="4680" w:type="dxa"/>
+            <w:tcBorders>
+              <w:left w:val="single" w:sz="4" w:space="0" w:color="000000"/>
+              <w:bottom w:val="single" w:sz="4" w:space="0" w:color="000000"/>
+              <w:right w:val="single" w:sz="4" w:space="0" w:color="000000"/>
+            </w:tcBorders>
+          </w:tcPr>
+          <w:p>
+            <w:pPr>
+              <w:pStyle w:val="Contenidodelatabla"/>
+              <w:jc w:val="left"/>
+              <w:rPr>
+                <w:rFonts w:ascii="Liberation Serif" w:hAnsi="Liberation Serif"/>
+                <w:b w:val="false"/>
+                <w:bCs w:val="false"/>
+                <w:i w:val="false"/>
+                <w:i w:val="false"/>
+                <w:iCs w:val="false"/>
+                <w:strike w:val="false"/>
+                <w:dstrike w:val="false"/>
+                <w:outline w:val="false"/>
+                <w:shadow w:val="false"/>
+                <w:color w:val="000000"/>
+                <w:sz w:val="24"/>
+                <w:szCs w:val="24"/>
+                <w:u w:val="none"/>
+              </w:rPr>
+            </w:pPr>
+            <w:r>
+              <w:rPr>
+                <w:rFonts w:ascii="Liberation Serif" w:hAnsi="Liberation Serif"/>
+                <w:b w:val="false"/>
+                <w:bCs w:val="false"/>
+                <w:i w:val="false"/>
+                <w:iCs w:val="false"/>
+                <w:strike w:val="false"/>
+                <w:dstrike w:val="false"/>
+                <w:outline w:val="false"/>
+                <w:shadow w:val="false"/>
+                <w:color w:val="000000"/>
+                <w:sz w:val="24"/>
+                <w:szCs w:val="24"/>
+                <w:u w:val="none"/>
+              </w:rPr>
+              <w:t>El sistema debera de tener un login de administrador para que este mismo pueda administrar el salon de belleza gestionando los servicios,combos,empleados,lugares de trabajos,los usuarios del sistema,el inventario,los metodos de pago,las citas y las cajas de venta.</w:t>
+            </w:r>
+          </w:p>
+          <w:p>
+            <w:pPr>
+              <w:pStyle w:val="Contenidodelatabla"/>
+              <w:jc w:val="left"/>
+              <w:rPr>
+                <w:rFonts w:ascii="Liberation Serif" w:hAnsi="Liberation Serif"/>
+                <w:b w:val="false"/>
+                <w:bCs w:val="false"/>
+                <w:i w:val="false"/>
+                <w:i w:val="false"/>
+                <w:iCs w:val="false"/>
+                <w:strike w:val="false"/>
+                <w:dstrike w:val="false"/>
+                <w:outline w:val="false"/>
+                <w:shadow w:val="false"/>
+                <w:color w:val="000000"/>
+                <w:sz w:val="24"/>
+                <w:szCs w:val="24"/>
+                <w:u w:val="none"/>
+              </w:rPr>
+            </w:pPr>
+            <w:r>
+              <w:rPr>
+                <w:rFonts w:ascii="Liberation Serif" w:hAnsi="Liberation Serif"/>
+                <w:b w:val="false"/>
+                <w:bCs w:val="false"/>
+                <w:i w:val="false"/>
+                <w:iCs w:val="false"/>
+                <w:strike w:val="false"/>
+                <w:dstrike w:val="false"/>
+                <w:outline w:val="false"/>
+                <w:shadow w:val="false"/>
+                <w:color w:val="000000"/>
+                <w:sz w:val="24"/>
+                <w:szCs w:val="24"/>
+                <w:u w:val="none"/>
+              </w:rPr>
+              <w:t>Se debera implementar un control de acceso de usuarios que el sistema pueda discriminar entre administradores,empleados y clientes cada uno con sus respectivos privilegios. Tambien el sistema tendra un control de productos usados para cada servicio dando alertas cuando alla poco stock de un producto. Cada servicio/combo mostrara los empleados a cargo de ese servicio/combo su nivel de profesionalismo y intereses por su colaboracion.</w:t>
+            </w:r>
+          </w:p>
+          <w:p>
+            <w:pPr>
+              <w:pStyle w:val="Contenidodelatabla"/>
+              <w:jc w:val="left"/>
+              <w:rPr>
+                <w:rFonts w:ascii="Liberation Serif" w:hAnsi="Liberation Serif"/>
+                <w:b w:val="false"/>
+                <w:bCs w:val="false"/>
+                <w:i w:val="false"/>
+                <w:i w:val="false"/>
+                <w:iCs w:val="false"/>
+                <w:strike w:val="false"/>
+                <w:dstrike w:val="false"/>
+                <w:outline w:val="false"/>
+                <w:shadow w:val="false"/>
+                <w:color w:val="000000"/>
+                <w:sz w:val="24"/>
+                <w:szCs w:val="24"/>
+                <w:u w:val="none"/>
+              </w:rPr>
+            </w:pPr>
+            <w:r>
+              <w:rPr>
+                <w:rFonts w:ascii="Liberation Serif" w:hAnsi="Liberation Serif"/>
+                <w:b w:val="false"/>
+                <w:bCs w:val="false"/>
+                <w:i w:val="false"/>
+                <w:iCs w:val="false"/>
+                <w:strike w:val="false"/>
+                <w:dstrike w:val="false"/>
+                <w:outline w:val="false"/>
+                <w:shadow w:val="false"/>
+                <w:color w:val="000000"/>
+                <w:sz w:val="24"/>
+                <w:szCs w:val="24"/>
+                <w:u w:val="none"/>
+              </w:rPr>
+              <w:t>Cada servicio/combo que un cliente seleccione y pague se le asignara una cita la cita contentra informacion como el nombre del empleado a cargo ,el precio, la fecha y la hora de la cita y el lugar donde se le realiazara el servio/combo.</w:t>
+            </w:r>
+          </w:p>
+          <w:p>
+            <w:pPr>
+              <w:pStyle w:val="Contenidodelatabla"/>
+              <w:jc w:val="left"/>
+              <w:rPr>
+                <w:rFonts w:ascii="Liberation Serif" w:hAnsi="Liberation Serif"/>
+                <w:b w:val="false"/>
+                <w:bCs w:val="false"/>
+                <w:i w:val="false"/>
+                <w:i w:val="false"/>
+                <w:iCs w:val="false"/>
+                <w:strike w:val="false"/>
+                <w:dstrike w:val="false"/>
+                <w:outline w:val="false"/>
+                <w:shadow w:val="false"/>
+                <w:color w:val="000000"/>
+                <w:sz w:val="24"/>
+                <w:szCs w:val="24"/>
+                <w:u w:val="none"/>
+              </w:rPr>
+            </w:pPr>
+            <w:r>
+              <w:rPr>
+                <w:rFonts w:ascii="Liberation Serif" w:hAnsi="Liberation Serif"/>
+                <w:b w:val="false"/>
+                <w:bCs w:val="false"/>
+                <w:i w:val="false"/>
+                <w:iCs w:val="false"/>
+                <w:strike w:val="false"/>
+                <w:dstrike w:val="false"/>
+                <w:outline w:val="false"/>
+                <w:shadow w:val="false"/>
+                <w:color w:val="000000"/>
+                <w:sz w:val="24"/>
+                <w:szCs w:val="24"/>
+                <w:u w:val="none"/>
+              </w:rPr>
+              <w:t>Cada servicio/combo debera de pagarse en caja virtual  esta caja contendra el precio unitario + el subtotal. Tambien la caja podra vender productos de belleza a parte y se debera de tener un registro de cada producto vendido e igualmente se debe almacenar el precio unitario y el subtotal.</w:t>
+            </w:r>
+          </w:p>
+          <w:p>
+            <w:pPr>
+              <w:pStyle w:val="Contenidodelatabla"/>
+              <w:jc w:val="left"/>
+              <w:rPr>
+                <w:rFonts w:ascii="Liberation Serif" w:hAnsi="Liberation Serif"/>
+                <w:b w:val="false"/>
+                <w:bCs w:val="false"/>
+                <w:i w:val="false"/>
+                <w:i w:val="false"/>
+                <w:iCs w:val="false"/>
+                <w:strike w:val="false"/>
+                <w:dstrike w:val="false"/>
+                <w:outline w:val="false"/>
+                <w:shadow w:val="false"/>
+                <w:color w:val="000000"/>
+                <w:sz w:val="24"/>
+                <w:szCs w:val="24"/>
+                <w:u w:val="none"/>
+              </w:rPr>
+            </w:pPr>
+            <w:r>
+              <w:rPr>
+                <w:rFonts w:ascii="Liberation Serif" w:hAnsi="Liberation Serif"/>
+                <w:b w:val="false"/>
+                <w:bCs w:val="false"/>
+                <w:i w:val="false"/>
+                <w:iCs w:val="false"/>
+                <w:strike w:val="false"/>
+                <w:dstrike w:val="false"/>
+                <w:outline w:val="false"/>
+                <w:shadow w:val="false"/>
+                <w:color w:val="000000"/>
+                <w:sz w:val="24"/>
+                <w:szCs w:val="24"/>
+                <w:u w:val="none"/>
+              </w:rPr>
+              <w:t>Al final de cada mes el sistema debera de tener un resumen de venta de productos y servicios/combos</w:t>
+            </w:r>
+          </w:p>
+        </w:tc>
+      </w:tr>
+      <w:tr>
+        <w:trPr/>
+        <w:tc>
+          <w:tcPr>
+            <w:tcW w:w="4679" w:type="dxa"/>
+            <w:tcBorders>
+              <w:left w:val="single" w:sz="4" w:space="0" w:color="000000"/>
+              <w:bottom w:val="single" w:sz="4" w:space="0" w:color="000000"/>
+            </w:tcBorders>
+          </w:tcPr>
+          <w:p>
+            <w:pPr>
+              <w:pStyle w:val="Contenidodelatabla"/>
+              <w:jc w:val="left"/>
+              <w:rPr>
+                <w:rFonts w:ascii="Liberation Serif" w:hAnsi="Liberation Serif"/>
+                <w:b w:val="false"/>
+                <w:bCs w:val="false"/>
+                <w:i w:val="false"/>
+                <w:i w:val="false"/>
+                <w:iCs w:val="false"/>
+                <w:strike w:val="false"/>
+                <w:dstrike w:val="false"/>
+                <w:outline w:val="false"/>
+                <w:shadow w:val="false"/>
+                <w:color w:val="000000"/>
+                <w:sz w:val="24"/>
+                <w:szCs w:val="24"/>
+                <w:u w:val="none"/>
+              </w:rPr>
+            </w:pPr>
+            <w:r>
+              <w:rPr>
+                <w:rFonts w:ascii="Liberation Serif" w:hAnsi="Liberation Serif"/>
+                <w:b w:val="false"/>
+                <w:bCs w:val="false"/>
+                <w:i w:val="false"/>
+                <w:iCs w:val="false"/>
+                <w:strike w:val="false"/>
+                <w:dstrike w:val="false"/>
+                <w:outline w:val="false"/>
+                <w:shadow w:val="false"/>
+                <w:color w:val="000000"/>
+                <w:sz w:val="24"/>
+                <w:szCs w:val="24"/>
+                <w:u w:val="none"/>
+              </w:rPr>
+              <w:t>Mundo del problema:</w:t>
+            </w:r>
+          </w:p>
+        </w:tc>
+        <w:tc>
+          <w:tcPr>
+            <w:tcW w:w="4680" w:type="dxa"/>
+            <w:tcBorders>
+              <w:left w:val="single" w:sz="4" w:space="0" w:color="000000"/>
+              <w:bottom w:val="single" w:sz="4" w:space="0" w:color="000000"/>
+              <w:right w:val="single" w:sz="4" w:space="0" w:color="000000"/>
+            </w:tcBorders>
+          </w:tcPr>
+          <w:p>
+            <w:pPr>
+              <w:pStyle w:val="Contenidodelatabla"/>
+              <w:jc w:val="left"/>
+              <w:rPr>
+                <w:rFonts w:ascii="Liberation Serif" w:hAnsi="Liberation Serif"/>
+                <w:b w:val="false"/>
+                <w:bCs w:val="false"/>
+                <w:i w:val="false"/>
+                <w:i w:val="false"/>
+                <w:iCs w:val="false"/>
+                <w:strike w:val="false"/>
+                <w:dstrike w:val="false"/>
+                <w:outline w:val="false"/>
+                <w:shadow w:val="false"/>
+                <w:color w:val="000000"/>
+                <w:sz w:val="24"/>
+                <w:szCs w:val="24"/>
+                <w:u w:val="none"/>
+              </w:rPr>
+            </w:pPr>
+            <w:r>
+              <w:rPr>
+                <w:rFonts w:ascii="Liberation Serif" w:hAnsi="Liberation Serif"/>
+                <w:b w:val="false"/>
+                <w:bCs w:val="false"/>
+                <w:i w:val="false"/>
+                <w:iCs w:val="false"/>
+                <w:strike w:val="false"/>
+                <w:dstrike w:val="false"/>
+                <w:outline w:val="false"/>
+                <w:shadow w:val="false"/>
+                <w:color w:val="000000"/>
+                <w:sz w:val="24"/>
+                <w:szCs w:val="24"/>
+                <w:u w:val="none"/>
+              </w:rPr>
+              <w:t>Se requiere un sistema para gestionar un salon de belleza de manera sensilla rapida y eficaz. Facilitando tambien la comodidad de los clientes.</w:t>
+            </w:r>
+          </w:p>
+        </w:tc>
+      </w:tr>
+      <w:tr>
+        <w:trPr/>
+        <w:tc>
+          <w:tcPr>
+            <w:tcW w:w="4679" w:type="dxa"/>
+            <w:tcBorders>
+              <w:left w:val="single" w:sz="4" w:space="0" w:color="000000"/>
+              <w:bottom w:val="single" w:sz="4" w:space="0" w:color="000000"/>
+            </w:tcBorders>
+          </w:tcPr>
+          <w:p>
+            <w:pPr>
+              <w:pStyle w:val="Contenidodelatabla"/>
+              <w:jc w:val="left"/>
+              <w:rPr>
+                <w:rFonts w:ascii="Liberation Serif" w:hAnsi="Liberation Serif"/>
+                <w:b w:val="false"/>
+                <w:bCs w:val="false"/>
+                <w:i w:val="false"/>
+                <w:i w:val="false"/>
+                <w:iCs w:val="false"/>
+                <w:strike w:val="false"/>
+                <w:dstrike w:val="false"/>
+                <w:outline w:val="false"/>
+                <w:shadow w:val="false"/>
+                <w:color w:val="000000"/>
+                <w:sz w:val="24"/>
+                <w:szCs w:val="24"/>
+                <w:u w:val="none"/>
+              </w:rPr>
+            </w:pPr>
+            <w:r>
+              <w:rPr>
+                <w:rFonts w:ascii="Liberation Serif" w:hAnsi="Liberation Serif"/>
+                <w:b w:val="false"/>
+                <w:bCs w:val="false"/>
+                <w:i w:val="false"/>
+                <w:iCs w:val="false"/>
+                <w:strike w:val="false"/>
+                <w:dstrike w:val="false"/>
+                <w:outline w:val="false"/>
+                <w:shadow w:val="false"/>
+                <w:color w:val="000000"/>
+                <w:sz w:val="24"/>
+                <w:szCs w:val="24"/>
+                <w:u w:val="none"/>
+              </w:rPr>
+              <w:t>Requerimientos no funcionales:</w:t>
+            </w:r>
+          </w:p>
+        </w:tc>
+        <w:tc>
+          <w:tcPr>
+            <w:tcW w:w="4680" w:type="dxa"/>
+            <w:tcBorders>
+              <w:left w:val="single" w:sz="4" w:space="0" w:color="000000"/>
+              <w:bottom w:val="single" w:sz="4" w:space="0" w:color="000000"/>
+              <w:right w:val="single" w:sz="4" w:space="0" w:color="000000"/>
+            </w:tcBorders>
+          </w:tcPr>
+          <w:p>
+            <w:pPr>
+              <w:pStyle w:val="Contenidodelatabla"/>
+              <w:jc w:val="left"/>
+              <w:rPr>
+                <w:rFonts w:ascii="Liberation Serif" w:hAnsi="Liberation Serif"/>
+                <w:b w:val="false"/>
+                <w:bCs w:val="false"/>
+                <w:i w:val="false"/>
+                <w:i w:val="false"/>
+                <w:iCs w:val="false"/>
+                <w:strike w:val="false"/>
+                <w:dstrike w:val="false"/>
+                <w:outline w:val="false"/>
+                <w:shadow w:val="false"/>
+                <w:color w:val="000000"/>
+                <w:sz w:val="24"/>
+                <w:szCs w:val="24"/>
+                <w:u w:val="none"/>
+              </w:rPr>
+            </w:pPr>
+            <w:r>
+              <w:rPr>
+                <w:rFonts w:ascii="Liberation Serif" w:hAnsi="Liberation Serif"/>
+                <w:b w:val="false"/>
+                <w:bCs w:val="false"/>
+                <w:i w:val="false"/>
+                <w:iCs w:val="false"/>
+                <w:strike w:val="false"/>
+                <w:dstrike w:val="false"/>
+                <w:outline w:val="false"/>
+                <w:shadow w:val="false"/>
+                <w:color w:val="000000"/>
+                <w:sz w:val="24"/>
+                <w:szCs w:val="24"/>
+                <w:u w:val="none"/>
+              </w:rPr>
+              <w:t>El sistema debe ser seguro con control de acceso por usuario,encriptacion de contraseñas o datos sensibles.</w:t>
+            </w:r>
+          </w:p>
+          <w:p>
+            <w:pPr>
+              <w:pStyle w:val="Contenidodelatabla"/>
+              <w:jc w:val="left"/>
+              <w:rPr>
+                <w:rFonts w:ascii="Liberation Serif" w:hAnsi="Liberation Serif"/>
+                <w:b w:val="false"/>
+                <w:bCs w:val="false"/>
+                <w:i w:val="false"/>
+                <w:i w:val="false"/>
+                <w:iCs w:val="false"/>
+                <w:strike w:val="false"/>
+                <w:dstrike w:val="false"/>
+                <w:outline w:val="false"/>
+                <w:shadow w:val="false"/>
+                <w:color w:val="000000"/>
+                <w:sz w:val="24"/>
+                <w:szCs w:val="24"/>
+                <w:u w:val="none"/>
+              </w:rPr>
+            </w:pPr>
+            <w:r>
+              <w:rPr>
+                <w:rFonts w:ascii="Liberation Serif" w:hAnsi="Liberation Serif"/>
+                <w:b w:val="false"/>
+                <w:bCs w:val="false"/>
+                <w:i w:val="false"/>
+                <w:iCs w:val="false"/>
+                <w:strike w:val="false"/>
+                <w:dstrike w:val="false"/>
+                <w:outline w:val="false"/>
+                <w:shadow w:val="false"/>
+                <w:color w:val="000000"/>
+                <w:sz w:val="24"/>
+                <w:szCs w:val="24"/>
+                <w:u w:val="none"/>
+              </w:rPr>
+              <w:t>Garantizar el sistema rapido y seguro sus interfacez deben ser intuitivas y facil para los usuarios.</w:t>
+            </w:r>
+          </w:p>
+          <w:p>
+            <w:pPr>
+              <w:pStyle w:val="Contenidodelatabla"/>
+              <w:jc w:val="left"/>
+              <w:rPr>
+                <w:rFonts w:ascii="Liberation Serif" w:hAnsi="Liberation Serif"/>
+                <w:b w:val="false"/>
+                <w:bCs w:val="false"/>
+                <w:i w:val="false"/>
+                <w:i w:val="false"/>
+                <w:iCs w:val="false"/>
+                <w:strike w:val="false"/>
+                <w:dstrike w:val="false"/>
+                <w:outline w:val="false"/>
+                <w:shadow w:val="false"/>
+                <w:color w:val="000000"/>
+                <w:sz w:val="24"/>
+                <w:szCs w:val="24"/>
+                <w:u w:val="none"/>
+              </w:rPr>
+            </w:pPr>
+            <w:r>
+              <w:rPr>
+                <w:rFonts w:ascii="Liberation Serif" w:hAnsi="Liberation Serif"/>
+                <w:b w:val="false"/>
+                <w:bCs w:val="false"/>
+                <w:i w:val="false"/>
+                <w:iCs w:val="false"/>
+                <w:strike w:val="false"/>
+                <w:dstrike w:val="false"/>
+                <w:outline w:val="false"/>
+                <w:shadow w:val="false"/>
+                <w:color w:val="000000"/>
+                <w:sz w:val="24"/>
+                <w:szCs w:val="24"/>
+                <w:u w:val="none"/>
+              </w:rPr>
+              <w:t>Se debe respetar el modelo MVC y la POO dentro del sistema para un codigo facil y legible de entender para futuras mejoras en el sistema.</w:t>
+            </w:r>
+          </w:p>
+        </w:tc>
+      </w:tr>
+    </w:tbl>
+    <w:p>
+      <w:pPr>
+        <w:pStyle w:val="BodyText"/>
+        <w:jc w:val="center"/>
+        <w:rPr>
+          <w:rFonts w:ascii="times new roman" w:hAnsi="times new roman"/>
+          <w:sz w:val="28"/>
+          <w:szCs w:val="28"/>
+        </w:rPr>
+      </w:pPr>
+      <w:r>
+        <w:rPr>
+          <w:rFonts w:ascii="times new roman" w:hAnsi="times new roman"/>
+          <w:sz w:val="28"/>
+          <w:szCs w:val="28"/>
+        </w:rPr>
+      </w:r>
+    </w:p>
+    <w:p>
+      <w:pPr>
+        <w:pStyle w:val="BodyText"/>
+        <w:jc w:val="center"/>
+        <w:rPr>
+          <w:rFonts w:ascii="times new roman" w:hAnsi="times new roman"/>
+          <w:sz w:val="28"/>
+          <w:szCs w:val="28"/>
+        </w:rPr>
+      </w:pPr>
+      <w:r>
+        <w:rPr>
+          <w:rFonts w:ascii="times new roman" w:hAnsi="times new roman"/>
+          <w:sz w:val="28"/>
+          <w:szCs w:val="28"/>
+        </w:rPr>
+        <w:t>Requerimientos Funcionales</w:t>
+      </w:r>
+    </w:p>
+    <w:p>
+      <w:pPr>
+        <w:pStyle w:val="BodyText"/>
+        <w:jc w:val="center"/>
+        <w:rPr>
+          <w:rFonts w:ascii="times new roman" w:hAnsi="times new roman"/>
+          <w:sz w:val="28"/>
+          <w:szCs w:val="28"/>
+        </w:rPr>
+      </w:pPr>
+      <w:r>
+        <w:rPr>
+          <w:rFonts w:ascii="times new roman" w:hAnsi="times new roman"/>
+          <w:sz w:val="28"/>
+          <w:szCs w:val="28"/>
+        </w:rPr>
+      </w:r>
+    </w:p>
+    <w:tbl>
+      <w:tblPr>
+        <w:tblW w:w="5000" w:type="pct"/>
+        <w:jc w:val="left"/>
+        <w:tblInd w:w="55" w:type="dxa"/>
+        <w:tblLayout w:type="fixed"/>
+        <w:tblCellMar>
+          <w:top w:w="55" w:type="dxa"/>
+          <w:left w:w="55" w:type="dxa"/>
+          <w:bottom w:w="55" w:type="dxa"/>
+          <w:right w:w="55" w:type="dxa"/>
+        </w:tblCellMar>
+      </w:tblPr>
+      <w:tblGrid>
+        <w:gridCol w:w="4680"/>
+        <w:gridCol w:w="4680"/>
+      </w:tblGrid>
+      <w:tr>
+        <w:trPr/>
+        <w:tc>
+          <w:tcPr>
+            <w:tcW w:w="4680" w:type="dxa"/>
+            <w:tcBorders>
+              <w:top w:val="single" w:sz="4" w:space="0" w:color="000000"/>
+              <w:left w:val="single" w:sz="4" w:space="0" w:color="000000"/>
+              <w:bottom w:val="single" w:sz="4" w:space="0" w:color="000000"/>
+            </w:tcBorders>
+          </w:tcPr>
+          <w:p>
+            <w:pPr>
+              <w:pStyle w:val="Contenidodelatabla"/>
+              <w:jc w:val="left"/>
+              <w:rPr>
+                <w:rFonts w:ascii="Liberation Serif" w:hAnsi="Liberation Serif"/>
+                <w:b w:val="false"/>
+                <w:bCs w:val="false"/>
+                <w:i w:val="false"/>
+                <w:i w:val="false"/>
+                <w:iCs w:val="false"/>
+                <w:strike w:val="false"/>
+                <w:dstrike w:val="false"/>
+                <w:outline w:val="false"/>
+                <w:shadow w:val="false"/>
+                <w:color w:val="000000"/>
+                <w:sz w:val="24"/>
+                <w:szCs w:val="24"/>
+                <w:u w:val="none"/>
+              </w:rPr>
+            </w:pPr>
+            <w:r>
+              <w:rPr>
+                <w:rFonts w:ascii="Liberation Serif" w:hAnsi="Liberation Serif"/>
+                <w:b w:val="false"/>
+                <w:bCs w:val="false"/>
+                <w:i w:val="false"/>
+                <w:iCs w:val="false"/>
+                <w:strike w:val="false"/>
+                <w:dstrike w:val="false"/>
+                <w:outline w:val="false"/>
+                <w:shadow w:val="false"/>
+                <w:color w:val="000000"/>
+                <w:sz w:val="24"/>
+                <w:szCs w:val="24"/>
+                <w:u w:val="none"/>
+              </w:rPr>
+              <w:t>Nombre:</w:t>
+            </w:r>
+          </w:p>
+        </w:tc>
+        <w:tc>
+          <w:tcPr>
+            <w:tcW w:w="4680" w:type="dxa"/>
+            <w:tcBorders>
+              <w:top w:val="single" w:sz="4" w:space="0" w:color="000000"/>
+              <w:left w:val="single" w:sz="4" w:space="0" w:color="000000"/>
+              <w:bottom w:val="single" w:sz="4" w:space="0" w:color="000000"/>
+              <w:right w:val="single" w:sz="4" w:space="0" w:color="000000"/>
+            </w:tcBorders>
+          </w:tcPr>
+          <w:p>
+            <w:pPr>
+              <w:pStyle w:val="Contenidodelatabla"/>
+              <w:jc w:val="left"/>
+              <w:rPr>
+                <w:rFonts w:ascii="Liberation Serif" w:hAnsi="Liberation Serif"/>
+                <w:b w:val="false"/>
+                <w:bCs w:val="false"/>
+                <w:i w:val="false"/>
+                <w:i w:val="false"/>
+                <w:iCs w:val="false"/>
+                <w:strike w:val="false"/>
+                <w:dstrike w:val="false"/>
+                <w:outline w:val="false"/>
+                <w:shadow w:val="false"/>
+                <w:color w:val="000000"/>
+                <w:sz w:val="24"/>
+                <w:szCs w:val="24"/>
+                <w:u w:val="none"/>
+              </w:rPr>
+            </w:pPr>
+            <w:r>
+              <w:rPr>
+                <w:rFonts w:ascii="Liberation Serif" w:hAnsi="Liberation Serif"/>
+                <w:b w:val="false"/>
+                <w:bCs w:val="false"/>
+                <w:i w:val="false"/>
+                <w:iCs w:val="false"/>
+                <w:strike w:val="false"/>
+                <w:dstrike w:val="false"/>
+                <w:outline w:val="false"/>
+                <w:shadow w:val="false"/>
+                <w:color w:val="000000"/>
+                <w:sz w:val="24"/>
+                <w:szCs w:val="24"/>
+                <w:u w:val="none"/>
+              </w:rPr>
+              <w:t>R1:Gestion de servicios</w:t>
+            </w:r>
+          </w:p>
+        </w:tc>
+      </w:tr>
+      <w:tr>
+        <w:trPr/>
+        <w:tc>
+          <w:tcPr>
+            <w:tcW w:w="4680" w:type="dxa"/>
+            <w:tcBorders>
+              <w:left w:val="single" w:sz="4" w:space="0" w:color="000000"/>
+              <w:bottom w:val="single" w:sz="4" w:space="0" w:color="000000"/>
+            </w:tcBorders>
+          </w:tcPr>
+          <w:p>
+            <w:pPr>
+              <w:pStyle w:val="Contenidodelatabla"/>
+              <w:jc w:val="left"/>
+              <w:rPr>
+                <w:rFonts w:ascii="Liberation Serif" w:hAnsi="Liberation Serif"/>
+                <w:b w:val="false"/>
+                <w:bCs w:val="false"/>
+                <w:i w:val="false"/>
+                <w:i w:val="false"/>
+                <w:iCs w:val="false"/>
+                <w:strike w:val="false"/>
+                <w:dstrike w:val="false"/>
+                <w:outline w:val="false"/>
+                <w:shadow w:val="false"/>
+                <w:color w:val="000000"/>
+                <w:sz w:val="24"/>
+                <w:szCs w:val="24"/>
+                <w:u w:val="none"/>
+              </w:rPr>
+            </w:pPr>
+            <w:r>
+              <w:rPr>
+                <w:rFonts w:ascii="Liberation Serif" w:hAnsi="Liberation Serif"/>
+                <w:b w:val="false"/>
+                <w:bCs w:val="false"/>
+                <w:i w:val="false"/>
+                <w:iCs w:val="false"/>
+                <w:strike w:val="false"/>
+                <w:dstrike w:val="false"/>
+                <w:outline w:val="false"/>
+                <w:shadow w:val="false"/>
+                <w:color w:val="000000"/>
+                <w:sz w:val="24"/>
+                <w:szCs w:val="24"/>
+                <w:u w:val="none"/>
+              </w:rPr>
+              <w:t>Resumen:</w:t>
+            </w:r>
+          </w:p>
+        </w:tc>
+        <w:tc>
+          <w:tcPr>
+            <w:tcW w:w="4680" w:type="dxa"/>
+            <w:tcBorders>
+              <w:left w:val="single" w:sz="4" w:space="0" w:color="000000"/>
+              <w:bottom w:val="single" w:sz="4" w:space="0" w:color="000000"/>
+              <w:right w:val="single" w:sz="4" w:space="0" w:color="000000"/>
+            </w:tcBorders>
+          </w:tcPr>
+          <w:p>
+            <w:pPr>
+              <w:pStyle w:val="Contenidodelatabla"/>
+              <w:jc w:val="left"/>
+              <w:rPr>
+                <w:rFonts w:ascii="Liberation Serif" w:hAnsi="Liberation Serif"/>
+                <w:b w:val="false"/>
+                <w:bCs w:val="false"/>
+                <w:i w:val="false"/>
+                <w:i w:val="false"/>
+                <w:iCs w:val="false"/>
+                <w:strike w:val="false"/>
+                <w:dstrike w:val="false"/>
+                <w:outline w:val="false"/>
+                <w:shadow w:val="false"/>
+                <w:color w:val="000000"/>
+                <w:sz w:val="24"/>
+                <w:szCs w:val="24"/>
+                <w:u w:val="none"/>
+              </w:rPr>
+            </w:pPr>
+            <w:r>
+              <w:rPr>
+                <w:rFonts w:ascii="Liberation Serif" w:hAnsi="Liberation Serif"/>
+                <w:b w:val="false"/>
+                <w:bCs w:val="false"/>
+                <w:i w:val="false"/>
+                <w:iCs w:val="false"/>
+                <w:strike w:val="false"/>
+                <w:dstrike w:val="false"/>
+                <w:outline w:val="false"/>
+                <w:shadow w:val="false"/>
+                <w:color w:val="000000"/>
+                <w:sz w:val="24"/>
+                <w:szCs w:val="24"/>
+                <w:u w:val="none"/>
+              </w:rPr>
+              <w:t>Permite gestionar los servicios del salon de belleza</w:t>
+            </w:r>
+          </w:p>
+        </w:tc>
+      </w:tr>
+      <w:tr>
+        <w:trPr/>
+        <w:tc>
+          <w:tcPr>
+            <w:tcW w:w="4680" w:type="dxa"/>
+            <w:tcBorders>
+              <w:left w:val="single" w:sz="4" w:space="0" w:color="000000"/>
+              <w:bottom w:val="single" w:sz="4" w:space="0" w:color="000000"/>
+            </w:tcBorders>
+          </w:tcPr>
+          <w:p>
+            <w:pPr>
+              <w:pStyle w:val="Contenidodelatabla"/>
+              <w:jc w:val="left"/>
+              <w:rPr>
+                <w:rFonts w:ascii="Liberation Serif" w:hAnsi="Liberation Serif"/>
+                <w:b w:val="false"/>
+                <w:bCs w:val="false"/>
+                <w:i w:val="false"/>
+                <w:i w:val="false"/>
+                <w:iCs w:val="false"/>
+                <w:strike w:val="false"/>
+                <w:dstrike w:val="false"/>
+                <w:outline w:val="false"/>
+                <w:shadow w:val="false"/>
+                <w:color w:val="000000"/>
+                <w:sz w:val="24"/>
+                <w:szCs w:val="24"/>
+                <w:u w:val="none"/>
+              </w:rPr>
+            </w:pPr>
+            <w:r>
+              <w:rPr>
+                <w:rFonts w:ascii="Liberation Serif" w:hAnsi="Liberation Serif"/>
+                <w:b w:val="false"/>
+                <w:bCs w:val="false"/>
+                <w:i w:val="false"/>
+                <w:iCs w:val="false"/>
+                <w:strike w:val="false"/>
+                <w:dstrike w:val="false"/>
+                <w:outline w:val="false"/>
+                <w:shadow w:val="false"/>
+                <w:color w:val="000000"/>
+                <w:sz w:val="24"/>
+                <w:szCs w:val="24"/>
+                <w:u w:val="none"/>
+              </w:rPr>
+              <w:t>Entrada:</w:t>
+            </w:r>
+          </w:p>
+        </w:tc>
+        <w:tc>
+          <w:tcPr>
+            <w:tcW w:w="4680" w:type="dxa"/>
+            <w:tcBorders>
+              <w:left w:val="single" w:sz="4" w:space="0" w:color="000000"/>
+              <w:bottom w:val="single" w:sz="4" w:space="0" w:color="000000"/>
+              <w:right w:val="single" w:sz="4" w:space="0" w:color="000000"/>
+            </w:tcBorders>
+          </w:tcPr>
+          <w:p>
+            <w:pPr>
+              <w:pStyle w:val="Contenidodelatabla"/>
+              <w:jc w:val="left"/>
+              <w:rPr>
+                <w:rFonts w:ascii="Liberation Serif" w:hAnsi="Liberation Serif"/>
+                <w:b w:val="false"/>
+                <w:bCs w:val="false"/>
+                <w:i w:val="false"/>
+                <w:i w:val="false"/>
+                <w:iCs w:val="false"/>
+                <w:strike w:val="false"/>
+                <w:dstrike w:val="false"/>
+                <w:outline w:val="false"/>
+                <w:shadow w:val="false"/>
+                <w:color w:val="000000"/>
+                <w:sz w:val="24"/>
+                <w:szCs w:val="24"/>
+                <w:u w:val="none"/>
+              </w:rPr>
+            </w:pPr>
+            <w:r>
+              <w:rPr>
+                <w:rFonts w:ascii="Liberation Serif" w:hAnsi="Liberation Serif"/>
+                <w:b w:val="false"/>
+                <w:bCs w:val="false"/>
+                <w:i w:val="false"/>
+                <w:iCs w:val="false"/>
+                <w:strike w:val="false"/>
+                <w:dstrike w:val="false"/>
+                <w:outline w:val="false"/>
+                <w:shadow w:val="false"/>
+                <w:color w:val="000000"/>
+                <w:sz w:val="24"/>
+                <w:szCs w:val="24"/>
+                <w:u w:val="none"/>
+              </w:rPr>
+              <w:t>Nombre</w:t>
+            </w:r>
+          </w:p>
+          <w:p>
+            <w:pPr>
+              <w:pStyle w:val="Contenidodelatabla"/>
+              <w:jc w:val="left"/>
+              <w:rPr>
+                <w:rFonts w:ascii="Liberation Serif" w:hAnsi="Liberation Serif"/>
+                <w:b w:val="false"/>
+                <w:bCs w:val="false"/>
+                <w:i w:val="false"/>
+                <w:i w:val="false"/>
+                <w:iCs w:val="false"/>
+                <w:strike w:val="false"/>
+                <w:dstrike w:val="false"/>
+                <w:outline w:val="false"/>
+                <w:shadow w:val="false"/>
+                <w:color w:val="000000"/>
+                <w:sz w:val="24"/>
+                <w:szCs w:val="24"/>
+                <w:u w:val="none"/>
+              </w:rPr>
+            </w:pPr>
+            <w:r>
+              <w:rPr>
+                <w:rFonts w:ascii="Liberation Serif" w:hAnsi="Liberation Serif"/>
+                <w:b w:val="false"/>
+                <w:bCs w:val="false"/>
+                <w:i w:val="false"/>
+                <w:iCs w:val="false"/>
+                <w:strike w:val="false"/>
+                <w:dstrike w:val="false"/>
+                <w:outline w:val="false"/>
+                <w:shadow w:val="false"/>
+                <w:color w:val="000000"/>
+                <w:sz w:val="24"/>
+                <w:szCs w:val="24"/>
+                <w:u w:val="none"/>
+              </w:rPr>
+              <w:t>Descripción</w:t>
+            </w:r>
+          </w:p>
+          <w:p>
+            <w:pPr>
+              <w:pStyle w:val="Contenidodelatabla"/>
+              <w:jc w:val="left"/>
+              <w:rPr>
+                <w:rFonts w:ascii="Liberation Serif" w:hAnsi="Liberation Serif"/>
+                <w:b w:val="false"/>
+                <w:bCs w:val="false"/>
+                <w:i w:val="false"/>
+                <w:i w:val="false"/>
+                <w:iCs w:val="false"/>
+                <w:strike w:val="false"/>
+                <w:dstrike w:val="false"/>
+                <w:outline w:val="false"/>
+                <w:shadow w:val="false"/>
+                <w:color w:val="000000"/>
+                <w:sz w:val="24"/>
+                <w:szCs w:val="24"/>
+                <w:u w:val="none"/>
+              </w:rPr>
+            </w:pPr>
+            <w:r>
+              <w:rPr>
+                <w:rFonts w:ascii="Liberation Serif" w:hAnsi="Liberation Serif"/>
+                <w:b w:val="false"/>
+                <w:bCs w:val="false"/>
+                <w:i w:val="false"/>
+                <w:iCs w:val="false"/>
+                <w:strike w:val="false"/>
+                <w:dstrike w:val="false"/>
+                <w:outline w:val="false"/>
+                <w:shadow w:val="false"/>
+                <w:color w:val="000000"/>
+                <w:sz w:val="24"/>
+                <w:szCs w:val="24"/>
+                <w:u w:val="none"/>
+              </w:rPr>
+              <w:t>Duracion</w:t>
+            </w:r>
+          </w:p>
+          <w:p>
+            <w:pPr>
+              <w:pStyle w:val="Contenidodelatabla"/>
+              <w:jc w:val="left"/>
+              <w:rPr>
+                <w:rFonts w:ascii="Liberation Serif" w:hAnsi="Liberation Serif"/>
+                <w:b w:val="false"/>
+                <w:bCs w:val="false"/>
+                <w:i w:val="false"/>
+                <w:i w:val="false"/>
+                <w:iCs w:val="false"/>
+                <w:strike w:val="false"/>
+                <w:dstrike w:val="false"/>
+                <w:outline w:val="false"/>
+                <w:shadow w:val="false"/>
+                <w:color w:val="000000"/>
+                <w:sz w:val="24"/>
+                <w:szCs w:val="24"/>
+                <w:u w:val="none"/>
+              </w:rPr>
+            </w:pPr>
+            <w:r>
+              <w:rPr>
+                <w:rFonts w:ascii="Liberation Serif" w:hAnsi="Liberation Serif"/>
+                <w:b w:val="false"/>
+                <w:bCs w:val="false"/>
+                <w:i w:val="false"/>
+                <w:iCs w:val="false"/>
+                <w:strike w:val="false"/>
+                <w:dstrike w:val="false"/>
+                <w:outline w:val="false"/>
+                <w:shadow w:val="false"/>
+                <w:color w:val="000000"/>
+                <w:sz w:val="24"/>
+                <w:szCs w:val="24"/>
+                <w:u w:val="none"/>
+              </w:rPr>
+              <w:t>id_tiempo servicio</w:t>
+            </w:r>
+          </w:p>
+          <w:p>
+            <w:pPr>
+              <w:pStyle w:val="Contenidodelatabla"/>
+              <w:jc w:val="left"/>
+              <w:rPr>
+                <w:rFonts w:ascii="Liberation Serif" w:hAnsi="Liberation Serif"/>
+                <w:b w:val="false"/>
+                <w:bCs w:val="false"/>
+                <w:i w:val="false"/>
+                <w:i w:val="false"/>
+                <w:iCs w:val="false"/>
+                <w:strike w:val="false"/>
+                <w:dstrike w:val="false"/>
+                <w:outline w:val="false"/>
+                <w:shadow w:val="false"/>
+                <w:color w:val="000000"/>
+                <w:sz w:val="24"/>
+                <w:szCs w:val="24"/>
+                <w:u w:val="none"/>
+              </w:rPr>
+            </w:pPr>
+            <w:r>
+              <w:rPr>
+                <w:rFonts w:ascii="Liberation Serif" w:hAnsi="Liberation Serif"/>
+                <w:b w:val="false"/>
+                <w:bCs w:val="false"/>
+                <w:i w:val="false"/>
+                <w:iCs w:val="false"/>
+                <w:strike w:val="false"/>
+                <w:dstrike w:val="false"/>
+                <w:outline w:val="false"/>
+                <w:shadow w:val="false"/>
+                <w:color w:val="000000"/>
+                <w:sz w:val="24"/>
+                <w:szCs w:val="24"/>
+                <w:u w:val="none"/>
+              </w:rPr>
+              <w:t>precio</w:t>
+            </w:r>
+          </w:p>
+          <w:p>
+            <w:pPr>
+              <w:pStyle w:val="Contenidodelatabla"/>
+              <w:jc w:val="left"/>
+              <w:rPr>
+                <w:rFonts w:ascii="Liberation Serif" w:hAnsi="Liberation Serif"/>
+                <w:b w:val="false"/>
+                <w:bCs w:val="false"/>
+                <w:i w:val="false"/>
+                <w:i w:val="false"/>
+                <w:iCs w:val="false"/>
+                <w:strike w:val="false"/>
+                <w:dstrike w:val="false"/>
+                <w:outline w:val="false"/>
+                <w:shadow w:val="false"/>
+                <w:color w:val="000000"/>
+                <w:sz w:val="24"/>
+                <w:szCs w:val="24"/>
+                <w:u w:val="none"/>
+              </w:rPr>
+            </w:pPr>
+            <w:r>
+              <w:rPr>
+                <w:rFonts w:ascii="Liberation Serif" w:hAnsi="Liberation Serif"/>
+                <w:b w:val="false"/>
+                <w:bCs w:val="false"/>
+                <w:i w:val="false"/>
+                <w:iCs w:val="false"/>
+                <w:strike w:val="false"/>
+                <w:dstrike w:val="false"/>
+                <w:outline w:val="false"/>
+                <w:shadow w:val="false"/>
+                <w:color w:val="000000"/>
+                <w:sz w:val="24"/>
+                <w:szCs w:val="24"/>
+                <w:u w:val="none"/>
+              </w:rPr>
+              <w:t>id_trabajador</w:t>
+            </w:r>
+          </w:p>
+          <w:p>
+            <w:pPr>
+              <w:pStyle w:val="Contenidodelatabla"/>
+              <w:jc w:val="left"/>
+              <w:rPr>
+                <w:rFonts w:ascii="Liberation Serif" w:hAnsi="Liberation Serif"/>
+                <w:b w:val="false"/>
+                <w:bCs w:val="false"/>
+                <w:i w:val="false"/>
+                <w:i w:val="false"/>
+                <w:iCs w:val="false"/>
+                <w:strike w:val="false"/>
+                <w:dstrike w:val="false"/>
+                <w:outline w:val="false"/>
+                <w:shadow w:val="false"/>
+                <w:color w:val="000000"/>
+                <w:sz w:val="24"/>
+                <w:szCs w:val="24"/>
+                <w:u w:val="none"/>
+              </w:rPr>
+            </w:pPr>
+            <w:r>
+              <w:rPr>
+                <w:rFonts w:ascii="Liberation Serif" w:hAnsi="Liberation Serif"/>
+                <w:b w:val="false"/>
+                <w:bCs w:val="false"/>
+                <w:i w:val="false"/>
+                <w:iCs w:val="false"/>
+                <w:strike w:val="false"/>
+                <w:dstrike w:val="false"/>
+                <w:outline w:val="false"/>
+                <w:shadow w:val="false"/>
+                <w:color w:val="000000"/>
+                <w:sz w:val="24"/>
+                <w:szCs w:val="24"/>
+                <w:u w:val="none"/>
+              </w:rPr>
+              <w:t>activo</w:t>
+            </w:r>
+          </w:p>
+        </w:tc>
+      </w:tr>
+      <w:tr>
+        <w:trPr/>
+        <w:tc>
+          <w:tcPr>
+            <w:tcW w:w="4680" w:type="dxa"/>
+            <w:tcBorders>
+              <w:left w:val="single" w:sz="4" w:space="0" w:color="000000"/>
+              <w:bottom w:val="single" w:sz="4" w:space="0" w:color="000000"/>
+            </w:tcBorders>
+          </w:tcPr>
+          <w:p>
+            <w:pPr>
+              <w:pStyle w:val="Contenidodelatabla"/>
+              <w:jc w:val="left"/>
+              <w:rPr>
+                <w:rFonts w:ascii="Liberation Serif" w:hAnsi="Liberation Serif"/>
+                <w:b w:val="false"/>
+                <w:bCs w:val="false"/>
+                <w:i w:val="false"/>
+                <w:i w:val="false"/>
+                <w:iCs w:val="false"/>
+                <w:strike w:val="false"/>
+                <w:dstrike w:val="false"/>
+                <w:outline w:val="false"/>
+                <w:shadow w:val="false"/>
+                <w:color w:val="000000"/>
+                <w:sz w:val="24"/>
+                <w:szCs w:val="24"/>
+                <w:u w:val="none"/>
+              </w:rPr>
+            </w:pPr>
+            <w:r>
+              <w:rPr>
+                <w:rFonts w:ascii="Liberation Serif" w:hAnsi="Liberation Serif"/>
+                <w:b w:val="false"/>
+                <w:bCs w:val="false"/>
+                <w:i w:val="false"/>
+                <w:iCs w:val="false"/>
+                <w:strike w:val="false"/>
+                <w:dstrike w:val="false"/>
+                <w:outline w:val="false"/>
+                <w:shadow w:val="false"/>
+                <w:color w:val="000000"/>
+                <w:sz w:val="24"/>
+                <w:szCs w:val="24"/>
+                <w:u w:val="none"/>
+              </w:rPr>
+              <w:t>Salida</w:t>
+            </w:r>
+          </w:p>
+        </w:tc>
+        <w:tc>
+          <w:tcPr>
+            <w:tcW w:w="4680" w:type="dxa"/>
+            <w:tcBorders>
+              <w:left w:val="single" w:sz="4" w:space="0" w:color="000000"/>
+              <w:bottom w:val="single" w:sz="4" w:space="0" w:color="000000"/>
+              <w:right w:val="single" w:sz="4" w:space="0" w:color="000000"/>
+            </w:tcBorders>
+          </w:tcPr>
+          <w:p>
+            <w:pPr>
+              <w:pStyle w:val="Contenidodelatabla"/>
+              <w:jc w:val="left"/>
+              <w:rPr>
+                <w:rFonts w:ascii="Liberation Serif" w:hAnsi="Liberation Serif"/>
+                <w:b w:val="false"/>
+                <w:bCs w:val="false"/>
+                <w:i w:val="false"/>
+                <w:i w:val="false"/>
+                <w:iCs w:val="false"/>
+                <w:strike w:val="false"/>
+                <w:dstrike w:val="false"/>
+                <w:outline w:val="false"/>
+                <w:shadow w:val="false"/>
+                <w:color w:val="000000"/>
+                <w:sz w:val="24"/>
+                <w:szCs w:val="24"/>
+                <w:u w:val="none"/>
+              </w:rPr>
+            </w:pPr>
+            <w:r>
+              <w:rPr>
+                <w:rFonts w:ascii="Liberation Serif" w:hAnsi="Liberation Serif"/>
+                <w:b w:val="false"/>
+                <w:bCs w:val="false"/>
+                <w:i w:val="false"/>
+                <w:iCs w:val="false"/>
+                <w:strike w:val="false"/>
+                <w:dstrike w:val="false"/>
+                <w:outline w:val="false"/>
+                <w:shadow w:val="false"/>
+                <w:color w:val="000000"/>
+                <w:sz w:val="24"/>
+                <w:szCs w:val="24"/>
+                <w:u w:val="none"/>
+              </w:rPr>
+              <w:t>Permite poder vizualizar,agregar,modificar y eliminar servicios</w:t>
+            </w:r>
+          </w:p>
+        </w:tc>
+      </w:tr>
+    </w:tbl>
+    <w:p>
+      <w:pPr>
+        <w:pStyle w:val="BodyText"/>
+        <w:jc w:val="center"/>
+        <w:rPr>
+          <w:rFonts w:ascii="times new roman" w:hAnsi="times new roman"/>
+          <w:sz w:val="28"/>
+          <w:szCs w:val="28"/>
+        </w:rPr>
+      </w:pPr>
+      <w:r>
+        <w:rPr>
+          <w:rFonts w:ascii="times new roman" w:hAnsi="times new roman"/>
+          <w:sz w:val="28"/>
+          <w:szCs w:val="28"/>
+        </w:rPr>
+      </w:r>
+    </w:p>
+    <w:p>
+      <w:pPr>
+        <w:pStyle w:val="BodyText"/>
+        <w:jc w:val="center"/>
+        <w:rPr>
+          <w:rFonts w:ascii="times new roman" w:hAnsi="times new roman"/>
+          <w:sz w:val="28"/>
+          <w:szCs w:val="28"/>
+        </w:rPr>
+      </w:pPr>
+      <w:r>
+        <w:rPr>
+          <w:rFonts w:ascii="times new roman" w:hAnsi="times new roman"/>
+          <w:sz w:val="28"/>
+          <w:szCs w:val="28"/>
+        </w:rPr>
+      </w:r>
+    </w:p>
+    <w:tbl>
+      <w:tblPr>
+        <w:tblW w:w="5000" w:type="pct"/>
+        <w:jc w:val="left"/>
+        <w:tblInd w:w="55" w:type="dxa"/>
+        <w:tblLayout w:type="fixed"/>
+        <w:tblCellMar>
+          <w:top w:w="55" w:type="dxa"/>
+          <w:left w:w="55" w:type="dxa"/>
+          <w:bottom w:w="55" w:type="dxa"/>
+          <w:right w:w="55" w:type="dxa"/>
+        </w:tblCellMar>
+      </w:tblPr>
+      <w:tblGrid>
+        <w:gridCol w:w="4680"/>
+        <w:gridCol w:w="4680"/>
+      </w:tblGrid>
+      <w:tr>
+        <w:trPr/>
+        <w:tc>
+          <w:tcPr>
+            <w:tcW w:w="4680" w:type="dxa"/>
+            <w:tcBorders>
+              <w:top w:val="single" w:sz="4" w:space="0" w:color="000000"/>
+              <w:left w:val="single" w:sz="4" w:space="0" w:color="000000"/>
+              <w:bottom w:val="single" w:sz="4" w:space="0" w:color="000000"/>
+            </w:tcBorders>
+          </w:tcPr>
+          <w:p>
+            <w:pPr>
+              <w:pStyle w:val="Contenidodelatabla"/>
+              <w:jc w:val="left"/>
+              <w:rPr>
+                <w:rFonts w:ascii="Liberation Serif" w:hAnsi="Liberation Serif"/>
+                <w:b w:val="false"/>
+                <w:bCs w:val="false"/>
+                <w:i w:val="false"/>
+                <w:i w:val="false"/>
+                <w:iCs w:val="false"/>
+                <w:strike w:val="false"/>
+                <w:dstrike w:val="false"/>
+                <w:outline w:val="false"/>
+                <w:shadow w:val="false"/>
+                <w:color w:val="000000"/>
+                <w:sz w:val="24"/>
+                <w:szCs w:val="24"/>
+                <w:u w:val="none"/>
+              </w:rPr>
+            </w:pPr>
+            <w:r>
+              <w:rPr>
+                <w:rFonts w:ascii="Liberation Serif" w:hAnsi="Liberation Serif"/>
+                <w:b w:val="false"/>
+                <w:bCs w:val="false"/>
+                <w:i w:val="false"/>
+                <w:iCs w:val="false"/>
+                <w:strike w:val="false"/>
+                <w:dstrike w:val="false"/>
+                <w:outline w:val="false"/>
+                <w:shadow w:val="false"/>
+                <w:color w:val="000000"/>
+                <w:sz w:val="24"/>
+                <w:szCs w:val="24"/>
+                <w:u w:val="none"/>
+              </w:rPr>
+              <w:t>Nombre:</w:t>
+            </w:r>
+          </w:p>
+        </w:tc>
+        <w:tc>
+          <w:tcPr>
+            <w:tcW w:w="4680" w:type="dxa"/>
+            <w:tcBorders>
+              <w:top w:val="single" w:sz="4" w:space="0" w:color="000000"/>
+              <w:left w:val="single" w:sz="4" w:space="0" w:color="000000"/>
+              <w:bottom w:val="single" w:sz="4" w:space="0" w:color="000000"/>
+              <w:right w:val="single" w:sz="4" w:space="0" w:color="000000"/>
+            </w:tcBorders>
+          </w:tcPr>
+          <w:p>
+            <w:pPr>
+              <w:pStyle w:val="Contenidodelatabla"/>
+              <w:jc w:val="left"/>
+              <w:rPr>
+                <w:rFonts w:ascii="Liberation Serif" w:hAnsi="Liberation Serif"/>
+                <w:b w:val="false"/>
+                <w:bCs w:val="false"/>
+                <w:i w:val="false"/>
+                <w:i w:val="false"/>
+                <w:iCs w:val="false"/>
+                <w:strike w:val="false"/>
+                <w:dstrike w:val="false"/>
+                <w:outline w:val="false"/>
+                <w:shadow w:val="false"/>
+                <w:color w:val="000000"/>
+                <w:sz w:val="24"/>
+                <w:szCs w:val="24"/>
+                <w:u w:val="none"/>
+              </w:rPr>
+            </w:pPr>
+            <w:r>
+              <w:rPr>
+                <w:rFonts w:ascii="Liberation Serif" w:hAnsi="Liberation Serif"/>
+                <w:b w:val="false"/>
+                <w:bCs w:val="false"/>
+                <w:i w:val="false"/>
+                <w:iCs w:val="false"/>
+                <w:strike w:val="false"/>
+                <w:dstrike w:val="false"/>
+                <w:outline w:val="false"/>
+                <w:shadow w:val="false"/>
+                <w:color w:val="000000"/>
+                <w:sz w:val="24"/>
+                <w:szCs w:val="24"/>
+                <w:u w:val="none"/>
+              </w:rPr>
+              <w:t>R2: Combos</w:t>
+            </w:r>
+          </w:p>
+        </w:tc>
+      </w:tr>
+      <w:tr>
+        <w:trPr/>
+        <w:tc>
+          <w:tcPr>
+            <w:tcW w:w="4680" w:type="dxa"/>
+            <w:tcBorders>
+              <w:left w:val="single" w:sz="4" w:space="0" w:color="000000"/>
+              <w:bottom w:val="single" w:sz="4" w:space="0" w:color="000000"/>
+            </w:tcBorders>
+          </w:tcPr>
+          <w:p>
+            <w:pPr>
+              <w:pStyle w:val="Contenidodelatabla"/>
+              <w:jc w:val="left"/>
+              <w:rPr>
+                <w:rFonts w:ascii="Liberation Serif" w:hAnsi="Liberation Serif"/>
+                <w:b w:val="false"/>
+                <w:bCs w:val="false"/>
+                <w:i w:val="false"/>
+                <w:i w:val="false"/>
+                <w:iCs w:val="false"/>
+                <w:strike w:val="false"/>
+                <w:dstrike w:val="false"/>
+                <w:outline w:val="false"/>
+                <w:shadow w:val="false"/>
+                <w:color w:val="000000"/>
+                <w:sz w:val="24"/>
+                <w:szCs w:val="24"/>
+                <w:u w:val="none"/>
+              </w:rPr>
+            </w:pPr>
+            <w:r>
+              <w:rPr>
+                <w:rFonts w:ascii="Liberation Serif" w:hAnsi="Liberation Serif"/>
+                <w:b w:val="false"/>
+                <w:bCs w:val="false"/>
+                <w:i w:val="false"/>
+                <w:iCs w:val="false"/>
+                <w:strike w:val="false"/>
+                <w:dstrike w:val="false"/>
+                <w:outline w:val="false"/>
+                <w:shadow w:val="false"/>
+                <w:color w:val="000000"/>
+                <w:sz w:val="24"/>
+                <w:szCs w:val="24"/>
+                <w:u w:val="none"/>
+              </w:rPr>
+              <w:t>Resumen:</w:t>
+            </w:r>
+          </w:p>
+        </w:tc>
+        <w:tc>
+          <w:tcPr>
+            <w:tcW w:w="4680" w:type="dxa"/>
+            <w:tcBorders>
+              <w:left w:val="single" w:sz="4" w:space="0" w:color="000000"/>
+              <w:bottom w:val="single" w:sz="4" w:space="0" w:color="000000"/>
+              <w:right w:val="single" w:sz="4" w:space="0" w:color="000000"/>
+            </w:tcBorders>
+          </w:tcPr>
+          <w:p>
+            <w:pPr>
+              <w:pStyle w:val="Contenidodelatabla"/>
+              <w:jc w:val="left"/>
+              <w:rPr>
+                <w:rFonts w:ascii="Liberation Serif" w:hAnsi="Liberation Serif"/>
+                <w:b w:val="false"/>
+                <w:bCs w:val="false"/>
+                <w:i w:val="false"/>
+                <w:i w:val="false"/>
+                <w:iCs w:val="false"/>
+                <w:strike w:val="false"/>
+                <w:dstrike w:val="false"/>
+                <w:outline w:val="false"/>
+                <w:shadow w:val="false"/>
+                <w:color w:val="000000"/>
+                <w:sz w:val="24"/>
+                <w:szCs w:val="24"/>
+                <w:u w:val="none"/>
+              </w:rPr>
+            </w:pPr>
+            <w:r>
+              <w:rPr>
+                <w:rFonts w:ascii="Liberation Serif" w:hAnsi="Liberation Serif"/>
+                <w:b w:val="false"/>
+                <w:bCs w:val="false"/>
+                <w:i w:val="false"/>
+                <w:iCs w:val="false"/>
+                <w:strike w:val="false"/>
+                <w:dstrike w:val="false"/>
+                <w:outline w:val="false"/>
+                <w:shadow w:val="false"/>
+                <w:color w:val="000000"/>
+                <w:sz w:val="24"/>
+                <w:szCs w:val="24"/>
+                <w:u w:val="none"/>
+              </w:rPr>
+              <w:t>Permite gestionar los combos del salon de belleza</w:t>
+            </w:r>
+          </w:p>
+        </w:tc>
+      </w:tr>
+      <w:tr>
+        <w:trPr/>
+        <w:tc>
+          <w:tcPr>
+            <w:tcW w:w="4680" w:type="dxa"/>
+            <w:tcBorders>
+              <w:left w:val="single" w:sz="4" w:space="0" w:color="000000"/>
+              <w:bottom w:val="single" w:sz="4" w:space="0" w:color="000000"/>
+            </w:tcBorders>
+          </w:tcPr>
+          <w:p>
+            <w:pPr>
+              <w:pStyle w:val="Contenidodelatabla"/>
+              <w:jc w:val="left"/>
+              <w:rPr>
+                <w:rFonts w:ascii="Liberation Serif" w:hAnsi="Liberation Serif"/>
+                <w:b w:val="false"/>
+                <w:bCs w:val="false"/>
+                <w:i w:val="false"/>
+                <w:i w:val="false"/>
+                <w:iCs w:val="false"/>
+                <w:strike w:val="false"/>
+                <w:dstrike w:val="false"/>
+                <w:outline w:val="false"/>
+                <w:shadow w:val="false"/>
+                <w:color w:val="000000"/>
+                <w:sz w:val="24"/>
+                <w:szCs w:val="24"/>
+                <w:u w:val="none"/>
+              </w:rPr>
+            </w:pPr>
+            <w:r>
+              <w:rPr>
+                <w:rFonts w:ascii="Liberation Serif" w:hAnsi="Liberation Serif"/>
+                <w:b w:val="false"/>
+                <w:bCs w:val="false"/>
+                <w:i w:val="false"/>
+                <w:iCs w:val="false"/>
+                <w:strike w:val="false"/>
+                <w:dstrike w:val="false"/>
+                <w:outline w:val="false"/>
+                <w:shadow w:val="false"/>
+                <w:color w:val="000000"/>
+                <w:sz w:val="24"/>
+                <w:szCs w:val="24"/>
+                <w:u w:val="none"/>
+              </w:rPr>
+              <w:t>Entrada:</w:t>
+            </w:r>
+          </w:p>
+        </w:tc>
+        <w:tc>
+          <w:tcPr>
+            <w:tcW w:w="4680" w:type="dxa"/>
+            <w:tcBorders>
+              <w:left w:val="single" w:sz="4" w:space="0" w:color="000000"/>
+              <w:bottom w:val="single" w:sz="4" w:space="0" w:color="000000"/>
+              <w:right w:val="single" w:sz="4" w:space="0" w:color="000000"/>
+            </w:tcBorders>
+          </w:tcPr>
+          <w:p>
+            <w:pPr>
+              <w:pStyle w:val="Contenidodelatabla"/>
+              <w:jc w:val="left"/>
+              <w:rPr>
+                <w:rFonts w:ascii="Liberation Serif" w:hAnsi="Liberation Serif"/>
+                <w:b w:val="false"/>
+                <w:bCs w:val="false"/>
+                <w:i w:val="false"/>
+                <w:i w:val="false"/>
+                <w:iCs w:val="false"/>
+                <w:strike w:val="false"/>
+                <w:dstrike w:val="false"/>
+                <w:outline w:val="false"/>
+                <w:shadow w:val="false"/>
+                <w:color w:val="000000"/>
+                <w:sz w:val="24"/>
+                <w:szCs w:val="24"/>
+                <w:u w:val="none"/>
+              </w:rPr>
+            </w:pPr>
+            <w:r>
+              <w:rPr>
+                <w:rFonts w:ascii="Liberation Serif" w:hAnsi="Liberation Serif"/>
+                <w:b w:val="false"/>
+                <w:bCs w:val="false"/>
+                <w:i w:val="false"/>
+                <w:iCs w:val="false"/>
+                <w:strike w:val="false"/>
+                <w:dstrike w:val="false"/>
+                <w:outline w:val="false"/>
+                <w:shadow w:val="false"/>
+                <w:color w:val="000000"/>
+                <w:sz w:val="24"/>
+                <w:szCs w:val="24"/>
+                <w:u w:val="none"/>
+              </w:rPr>
+              <w:t>Nombre</w:t>
+            </w:r>
+          </w:p>
+          <w:p>
+            <w:pPr>
+              <w:pStyle w:val="Contenidodelatabla"/>
+              <w:jc w:val="left"/>
+              <w:rPr>
+                <w:rFonts w:ascii="Liberation Serif" w:hAnsi="Liberation Serif"/>
+                <w:b w:val="false"/>
+                <w:bCs w:val="false"/>
+                <w:i w:val="false"/>
+                <w:i w:val="false"/>
+                <w:iCs w:val="false"/>
+                <w:strike w:val="false"/>
+                <w:dstrike w:val="false"/>
+                <w:outline w:val="false"/>
+                <w:shadow w:val="false"/>
+                <w:color w:val="000000"/>
+                <w:sz w:val="24"/>
+                <w:szCs w:val="24"/>
+                <w:u w:val="none"/>
+              </w:rPr>
+            </w:pPr>
+            <w:r>
+              <w:rPr>
+                <w:rFonts w:ascii="Liberation Serif" w:hAnsi="Liberation Serif"/>
+                <w:b w:val="false"/>
+                <w:bCs w:val="false"/>
+                <w:i w:val="false"/>
+                <w:iCs w:val="false"/>
+                <w:strike w:val="false"/>
+                <w:dstrike w:val="false"/>
+                <w:outline w:val="false"/>
+                <w:shadow w:val="false"/>
+                <w:color w:val="000000"/>
+                <w:sz w:val="24"/>
+                <w:szCs w:val="24"/>
+                <w:u w:val="none"/>
+              </w:rPr>
+              <w:t>Descripción</w:t>
+            </w:r>
+          </w:p>
+          <w:p>
+            <w:pPr>
+              <w:pStyle w:val="Contenidodelatabla"/>
+              <w:jc w:val="left"/>
+              <w:rPr>
+                <w:rFonts w:ascii="Liberation Serif" w:hAnsi="Liberation Serif"/>
+                <w:b w:val="false"/>
+                <w:bCs w:val="false"/>
+                <w:i w:val="false"/>
+                <w:i w:val="false"/>
+                <w:iCs w:val="false"/>
+                <w:strike w:val="false"/>
+                <w:dstrike w:val="false"/>
+                <w:outline w:val="false"/>
+                <w:shadow w:val="false"/>
+                <w:color w:val="000000"/>
+                <w:sz w:val="24"/>
+                <w:szCs w:val="24"/>
+                <w:u w:val="none"/>
+              </w:rPr>
+            </w:pPr>
+            <w:r>
+              <w:rPr>
+                <w:rFonts w:ascii="Liberation Serif" w:hAnsi="Liberation Serif"/>
+                <w:b w:val="false"/>
+                <w:bCs w:val="false"/>
+                <w:i w:val="false"/>
+                <w:iCs w:val="false"/>
+                <w:strike w:val="false"/>
+                <w:dstrike w:val="false"/>
+                <w:outline w:val="false"/>
+                <w:shadow w:val="false"/>
+                <w:color w:val="000000"/>
+                <w:sz w:val="24"/>
+                <w:szCs w:val="24"/>
+                <w:u w:val="none"/>
+              </w:rPr>
+              <w:t>Precio</w:t>
+            </w:r>
+          </w:p>
+          <w:p>
+            <w:pPr>
+              <w:pStyle w:val="Contenidodelatabla"/>
+              <w:jc w:val="left"/>
+              <w:rPr>
+                <w:rFonts w:ascii="Liberation Serif" w:hAnsi="Liberation Serif"/>
+                <w:b w:val="false"/>
+                <w:bCs w:val="false"/>
+                <w:i w:val="false"/>
+                <w:i w:val="false"/>
+                <w:iCs w:val="false"/>
+                <w:strike w:val="false"/>
+                <w:dstrike w:val="false"/>
+                <w:outline w:val="false"/>
+                <w:shadow w:val="false"/>
+                <w:color w:val="000000"/>
+                <w:sz w:val="24"/>
+                <w:szCs w:val="24"/>
+                <w:u w:val="none"/>
+              </w:rPr>
+            </w:pPr>
+            <w:r>
+              <w:rPr>
+                <w:rFonts w:ascii="Liberation Serif" w:hAnsi="Liberation Serif"/>
+                <w:b w:val="false"/>
+                <w:bCs w:val="false"/>
+                <w:i w:val="false"/>
+                <w:iCs w:val="false"/>
+                <w:strike w:val="false"/>
+                <w:dstrike w:val="false"/>
+                <w:outline w:val="false"/>
+                <w:shadow w:val="false"/>
+                <w:color w:val="000000"/>
+                <w:sz w:val="24"/>
+                <w:szCs w:val="24"/>
+                <w:u w:val="none"/>
+              </w:rPr>
+              <w:t>Imagen</w:t>
+            </w:r>
+          </w:p>
+          <w:p>
+            <w:pPr>
+              <w:pStyle w:val="Contenidodelatabla"/>
+              <w:jc w:val="left"/>
+              <w:rPr>
+                <w:rFonts w:ascii="Liberation Serif" w:hAnsi="Liberation Serif"/>
+                <w:b w:val="false"/>
+                <w:bCs w:val="false"/>
+                <w:i w:val="false"/>
+                <w:i w:val="false"/>
+                <w:iCs w:val="false"/>
+                <w:strike w:val="false"/>
+                <w:dstrike w:val="false"/>
+                <w:outline w:val="false"/>
+                <w:shadow w:val="false"/>
+                <w:color w:val="000000"/>
+                <w:sz w:val="24"/>
+                <w:szCs w:val="24"/>
+                <w:u w:val="none"/>
+              </w:rPr>
+            </w:pPr>
+            <w:r>
+              <w:rPr>
+                <w:rFonts w:ascii="Liberation Serif" w:hAnsi="Liberation Serif"/>
+                <w:b w:val="false"/>
+                <w:bCs w:val="false"/>
+                <w:i w:val="false"/>
+                <w:iCs w:val="false"/>
+                <w:strike w:val="false"/>
+                <w:dstrike w:val="false"/>
+                <w:outline w:val="false"/>
+                <w:shadow w:val="false"/>
+                <w:color w:val="000000"/>
+                <w:sz w:val="24"/>
+                <w:szCs w:val="24"/>
+                <w:u w:val="none"/>
+              </w:rPr>
+              <w:t>Activo</w:t>
+            </w:r>
+          </w:p>
+          <w:p>
+            <w:pPr>
+              <w:pStyle w:val="Contenidodelatabla"/>
+              <w:jc w:val="left"/>
+              <w:rPr>
+                <w:rFonts w:ascii="Liberation Serif" w:hAnsi="Liberation Serif"/>
+                <w:b w:val="false"/>
+                <w:bCs w:val="false"/>
+                <w:i w:val="false"/>
+                <w:i w:val="false"/>
+                <w:iCs w:val="false"/>
+                <w:strike w:val="false"/>
+                <w:dstrike w:val="false"/>
+                <w:outline w:val="false"/>
+                <w:shadow w:val="false"/>
+                <w:color w:val="000000"/>
+                <w:sz w:val="24"/>
+                <w:szCs w:val="24"/>
+                <w:u w:val="none"/>
+              </w:rPr>
+            </w:pPr>
+            <w:r>
+              <w:rPr>
+                <w:rFonts w:ascii="Liberation Serif" w:hAnsi="Liberation Serif"/>
+                <w:b w:val="false"/>
+                <w:bCs w:val="false"/>
+                <w:i w:val="false"/>
+                <w:iCs w:val="false"/>
+                <w:strike w:val="false"/>
+                <w:dstrike w:val="false"/>
+                <w:outline w:val="false"/>
+                <w:shadow w:val="false"/>
+                <w:color w:val="000000"/>
+                <w:sz w:val="24"/>
+                <w:szCs w:val="24"/>
+                <w:u w:val="none"/>
+              </w:rPr>
+              <w:t>Fecha creacion</w:t>
+            </w:r>
+          </w:p>
+        </w:tc>
+      </w:tr>
+      <w:tr>
+        <w:trPr/>
+        <w:tc>
+          <w:tcPr>
+            <w:tcW w:w="4680" w:type="dxa"/>
+            <w:tcBorders>
+              <w:left w:val="single" w:sz="4" w:space="0" w:color="000000"/>
+              <w:bottom w:val="single" w:sz="4" w:space="0" w:color="000000"/>
+            </w:tcBorders>
+          </w:tcPr>
+          <w:p>
+            <w:pPr>
+              <w:pStyle w:val="Contenidodelatabla"/>
+              <w:jc w:val="left"/>
+              <w:rPr>
+                <w:rFonts w:ascii="Liberation Serif" w:hAnsi="Liberation Serif"/>
+                <w:b w:val="false"/>
+                <w:bCs w:val="false"/>
+                <w:i w:val="false"/>
+                <w:i w:val="false"/>
+                <w:iCs w:val="false"/>
+                <w:strike w:val="false"/>
+                <w:dstrike w:val="false"/>
+                <w:outline w:val="false"/>
+                <w:shadow w:val="false"/>
+                <w:color w:val="000000"/>
+                <w:sz w:val="24"/>
+                <w:szCs w:val="24"/>
+                <w:u w:val="none"/>
+              </w:rPr>
+            </w:pPr>
+            <w:r>
+              <w:rPr>
+                <w:rFonts w:ascii="Liberation Serif" w:hAnsi="Liberation Serif"/>
+                <w:b w:val="false"/>
+                <w:bCs w:val="false"/>
+                <w:i w:val="false"/>
+                <w:iCs w:val="false"/>
+                <w:strike w:val="false"/>
+                <w:dstrike w:val="false"/>
+                <w:outline w:val="false"/>
+                <w:shadow w:val="false"/>
+                <w:color w:val="000000"/>
+                <w:sz w:val="24"/>
+                <w:szCs w:val="24"/>
+                <w:u w:val="none"/>
+              </w:rPr>
+              <w:t>Salida:</w:t>
+            </w:r>
+          </w:p>
+        </w:tc>
+        <w:tc>
+          <w:tcPr>
+            <w:tcW w:w="4680" w:type="dxa"/>
+            <w:tcBorders>
+              <w:left w:val="single" w:sz="4" w:space="0" w:color="000000"/>
+              <w:bottom w:val="single" w:sz="4" w:space="0" w:color="000000"/>
+              <w:right w:val="single" w:sz="4" w:space="0" w:color="000000"/>
+            </w:tcBorders>
+          </w:tcPr>
+          <w:p>
+            <w:pPr>
+              <w:pStyle w:val="Contenidodelatabla"/>
+              <w:jc w:val="left"/>
+              <w:rPr>
+                <w:rFonts w:ascii="Liberation Serif" w:hAnsi="Liberation Serif"/>
+                <w:b w:val="false"/>
+                <w:bCs w:val="false"/>
+                <w:i w:val="false"/>
+                <w:i w:val="false"/>
+                <w:iCs w:val="false"/>
+                <w:strike w:val="false"/>
+                <w:dstrike w:val="false"/>
+                <w:outline w:val="false"/>
+                <w:shadow w:val="false"/>
+                <w:color w:val="000000"/>
+                <w:sz w:val="24"/>
+                <w:szCs w:val="24"/>
+                <w:u w:val="none"/>
+              </w:rPr>
+            </w:pPr>
+            <w:r>
+              <w:rPr>
+                <w:rFonts w:ascii="Liberation Serif" w:hAnsi="Liberation Serif"/>
+                <w:b w:val="false"/>
+                <w:bCs w:val="false"/>
+                <w:i w:val="false"/>
+                <w:iCs w:val="false"/>
+                <w:strike w:val="false"/>
+                <w:dstrike w:val="false"/>
+                <w:outline w:val="false"/>
+                <w:shadow w:val="false"/>
+                <w:color w:val="000000"/>
+                <w:sz w:val="24"/>
+                <w:szCs w:val="24"/>
+                <w:u w:val="none"/>
+              </w:rPr>
+              <w:t>Permite poder vizualizar,agregar,modificar y eliminar combos</w:t>
+            </w:r>
+          </w:p>
+        </w:tc>
+      </w:tr>
+    </w:tbl>
+    <w:p>
+      <w:pPr>
+        <w:pStyle w:val="BodyText"/>
+        <w:jc w:val="center"/>
+        <w:rPr>
+          <w:rFonts w:ascii="times new roman" w:hAnsi="times new roman"/>
+          <w:sz w:val="28"/>
+          <w:szCs w:val="28"/>
+        </w:rPr>
+      </w:pPr>
+      <w:r>
+        <w:rPr>
+          <w:rFonts w:ascii="times new roman" w:hAnsi="times new roman"/>
+          <w:sz w:val="28"/>
+          <w:szCs w:val="28"/>
+        </w:rPr>
+      </w:r>
+    </w:p>
+    <w:p>
+      <w:pPr>
+        <w:pStyle w:val="BodyText"/>
+        <w:jc w:val="center"/>
+        <w:rPr>
+          <w:rFonts w:ascii="times new roman" w:hAnsi="times new roman"/>
+          <w:sz w:val="28"/>
+          <w:szCs w:val="28"/>
+        </w:rPr>
+      </w:pPr>
+      <w:r>
+        <w:rPr>
+          <w:rFonts w:ascii="times new roman" w:hAnsi="times new roman"/>
+          <w:sz w:val="28"/>
+          <w:szCs w:val="28"/>
+        </w:rPr>
+      </w:r>
+    </w:p>
+    <w:tbl>
+      <w:tblPr>
+        <w:tblW w:w="5000" w:type="pct"/>
+        <w:jc w:val="left"/>
+        <w:tblInd w:w="55" w:type="dxa"/>
+        <w:tblLayout w:type="fixed"/>
+        <w:tblCellMar>
+          <w:top w:w="55" w:type="dxa"/>
+          <w:left w:w="55" w:type="dxa"/>
+          <w:bottom w:w="55" w:type="dxa"/>
+          <w:right w:w="55" w:type="dxa"/>
+        </w:tblCellMar>
+      </w:tblPr>
+      <w:tblGrid>
+        <w:gridCol w:w="4680"/>
+        <w:gridCol w:w="4680"/>
+      </w:tblGrid>
+      <w:tr>
+        <w:trPr/>
+        <w:tc>
+          <w:tcPr>
+            <w:tcW w:w="4680" w:type="dxa"/>
+            <w:tcBorders>
+              <w:top w:val="single" w:sz="4" w:space="0" w:color="000000"/>
+              <w:left w:val="single" w:sz="4" w:space="0" w:color="000000"/>
+              <w:bottom w:val="single" w:sz="4" w:space="0" w:color="000000"/>
+            </w:tcBorders>
+          </w:tcPr>
+          <w:p>
+            <w:pPr>
+              <w:pStyle w:val="Contenidodelatabla"/>
+              <w:jc w:val="left"/>
+              <w:rPr>
+                <w:rFonts w:ascii="Liberation Serif" w:hAnsi="Liberation Serif"/>
+                <w:b w:val="false"/>
+                <w:bCs w:val="false"/>
+                <w:i w:val="false"/>
+                <w:i w:val="false"/>
+                <w:iCs w:val="false"/>
+                <w:strike w:val="false"/>
+                <w:dstrike w:val="false"/>
+                <w:outline w:val="false"/>
+                <w:shadow w:val="false"/>
+                <w:color w:val="000000"/>
+                <w:sz w:val="24"/>
+                <w:szCs w:val="24"/>
+                <w:u w:val="none"/>
+              </w:rPr>
+            </w:pPr>
+            <w:r>
+              <w:rPr>
+                <w:rFonts w:ascii="Liberation Serif" w:hAnsi="Liberation Serif"/>
+                <w:b w:val="false"/>
+                <w:bCs w:val="false"/>
+                <w:i w:val="false"/>
+                <w:iCs w:val="false"/>
+                <w:strike w:val="false"/>
+                <w:dstrike w:val="false"/>
+                <w:outline w:val="false"/>
+                <w:shadow w:val="false"/>
+                <w:color w:val="000000"/>
+                <w:sz w:val="24"/>
+                <w:szCs w:val="24"/>
+                <w:u w:val="none"/>
+              </w:rPr>
+              <w:t>Nombre:</w:t>
+            </w:r>
+          </w:p>
+        </w:tc>
+        <w:tc>
+          <w:tcPr>
+            <w:tcW w:w="4680" w:type="dxa"/>
+            <w:tcBorders>
+              <w:top w:val="single" w:sz="4" w:space="0" w:color="000000"/>
+              <w:left w:val="single" w:sz="4" w:space="0" w:color="000000"/>
+              <w:bottom w:val="single" w:sz="4" w:space="0" w:color="000000"/>
+              <w:right w:val="single" w:sz="4" w:space="0" w:color="000000"/>
+            </w:tcBorders>
+          </w:tcPr>
+          <w:p>
+            <w:pPr>
+              <w:pStyle w:val="Contenidodelatabla"/>
+              <w:jc w:val="left"/>
+              <w:rPr>
+                <w:rFonts w:ascii="Liberation Serif" w:hAnsi="Liberation Serif"/>
+                <w:b w:val="false"/>
+                <w:bCs w:val="false"/>
+                <w:i w:val="false"/>
+                <w:i w:val="false"/>
+                <w:iCs w:val="false"/>
+                <w:strike w:val="false"/>
+                <w:dstrike w:val="false"/>
+                <w:outline w:val="false"/>
+                <w:shadow w:val="false"/>
+                <w:color w:val="000000"/>
+                <w:sz w:val="24"/>
+                <w:szCs w:val="24"/>
+                <w:u w:val="none"/>
+              </w:rPr>
+            </w:pPr>
+            <w:r>
+              <w:rPr>
+                <w:rFonts w:ascii="Liberation Serif" w:hAnsi="Liberation Serif"/>
+                <w:b w:val="false"/>
+                <w:bCs w:val="false"/>
+                <w:i w:val="false"/>
+                <w:iCs w:val="false"/>
+                <w:strike w:val="false"/>
+                <w:dstrike w:val="false"/>
+                <w:outline w:val="false"/>
+                <w:shadow w:val="false"/>
+                <w:color w:val="000000"/>
+                <w:sz w:val="24"/>
+                <w:szCs w:val="24"/>
+                <w:u w:val="none"/>
+              </w:rPr>
+              <w:t>R3:Empleados</w:t>
+            </w:r>
+          </w:p>
+        </w:tc>
+      </w:tr>
+      <w:tr>
+        <w:trPr/>
+        <w:tc>
+          <w:tcPr>
+            <w:tcW w:w="4680" w:type="dxa"/>
+            <w:tcBorders>
+              <w:left w:val="single" w:sz="4" w:space="0" w:color="000000"/>
+              <w:bottom w:val="single" w:sz="4" w:space="0" w:color="000000"/>
+            </w:tcBorders>
+          </w:tcPr>
+          <w:p>
+            <w:pPr>
+              <w:pStyle w:val="Contenidodelatabla"/>
+              <w:jc w:val="left"/>
+              <w:rPr>
+                <w:rFonts w:ascii="Liberation Serif" w:hAnsi="Liberation Serif"/>
+                <w:b w:val="false"/>
+                <w:bCs w:val="false"/>
+                <w:i w:val="false"/>
+                <w:i w:val="false"/>
+                <w:iCs w:val="false"/>
+                <w:strike w:val="false"/>
+                <w:dstrike w:val="false"/>
+                <w:outline w:val="false"/>
+                <w:shadow w:val="false"/>
+                <w:color w:val="000000"/>
+                <w:sz w:val="24"/>
+                <w:szCs w:val="24"/>
+                <w:u w:val="none"/>
+              </w:rPr>
+            </w:pPr>
+            <w:r>
+              <w:rPr>
+                <w:rFonts w:ascii="Liberation Serif" w:hAnsi="Liberation Serif"/>
+                <w:b w:val="false"/>
+                <w:bCs w:val="false"/>
+                <w:i w:val="false"/>
+                <w:iCs w:val="false"/>
+                <w:strike w:val="false"/>
+                <w:dstrike w:val="false"/>
+                <w:outline w:val="false"/>
+                <w:shadow w:val="false"/>
+                <w:color w:val="000000"/>
+                <w:sz w:val="24"/>
+                <w:szCs w:val="24"/>
+                <w:u w:val="none"/>
+              </w:rPr>
+              <w:t>Resumen:</w:t>
+            </w:r>
+          </w:p>
+        </w:tc>
+        <w:tc>
+          <w:tcPr>
+            <w:tcW w:w="4680" w:type="dxa"/>
+            <w:tcBorders>
+              <w:left w:val="single" w:sz="4" w:space="0" w:color="000000"/>
+              <w:bottom w:val="single" w:sz="4" w:space="0" w:color="000000"/>
+              <w:right w:val="single" w:sz="4" w:space="0" w:color="000000"/>
+            </w:tcBorders>
+          </w:tcPr>
+          <w:p>
+            <w:pPr>
+              <w:pStyle w:val="Contenidodelatabla"/>
+              <w:jc w:val="left"/>
+              <w:rPr>
+                <w:rFonts w:ascii="Liberation Serif" w:hAnsi="Liberation Serif"/>
+                <w:b w:val="false"/>
+                <w:bCs w:val="false"/>
+                <w:i w:val="false"/>
+                <w:i w:val="false"/>
+                <w:iCs w:val="false"/>
+                <w:strike w:val="false"/>
+                <w:dstrike w:val="false"/>
+                <w:outline w:val="false"/>
+                <w:shadow w:val="false"/>
+                <w:color w:val="000000"/>
+                <w:sz w:val="24"/>
+                <w:szCs w:val="24"/>
+                <w:u w:val="none"/>
+              </w:rPr>
+            </w:pPr>
+            <w:r>
+              <w:rPr>
+                <w:rFonts w:ascii="Liberation Serif" w:hAnsi="Liberation Serif"/>
+                <w:b w:val="false"/>
+                <w:bCs w:val="false"/>
+                <w:i w:val="false"/>
+                <w:iCs w:val="false"/>
+                <w:strike w:val="false"/>
+                <w:dstrike w:val="false"/>
+                <w:outline w:val="false"/>
+                <w:shadow w:val="false"/>
+                <w:color w:val="000000"/>
+                <w:sz w:val="24"/>
+                <w:szCs w:val="24"/>
+                <w:u w:val="none"/>
+              </w:rPr>
+            </w:r>
+          </w:p>
+        </w:tc>
+      </w:tr>
+      <w:tr>
+        <w:trPr/>
+        <w:tc>
+          <w:tcPr>
+            <w:tcW w:w="4680" w:type="dxa"/>
+            <w:tcBorders>
+              <w:left w:val="single" w:sz="4" w:space="0" w:color="000000"/>
+              <w:bottom w:val="single" w:sz="4" w:space="0" w:color="000000"/>
+            </w:tcBorders>
+          </w:tcPr>
+          <w:p>
+            <w:pPr>
+              <w:pStyle w:val="Contenidodelatabla"/>
+              <w:jc w:val="left"/>
+              <w:rPr>
+                <w:rFonts w:ascii="Liberation Serif" w:hAnsi="Liberation Serif"/>
+                <w:b w:val="false"/>
+                <w:bCs w:val="false"/>
+                <w:i w:val="false"/>
+                <w:i w:val="false"/>
+                <w:iCs w:val="false"/>
+                <w:strike w:val="false"/>
+                <w:dstrike w:val="false"/>
+                <w:outline w:val="false"/>
+                <w:shadow w:val="false"/>
+                <w:color w:val="000000"/>
+                <w:sz w:val="24"/>
+                <w:szCs w:val="24"/>
+                <w:u w:val="none"/>
+              </w:rPr>
+            </w:pPr>
+            <w:r>
+              <w:rPr>
+                <w:rFonts w:ascii="Liberation Serif" w:hAnsi="Liberation Serif"/>
+                <w:b w:val="false"/>
+                <w:bCs w:val="false"/>
+                <w:i w:val="false"/>
+                <w:iCs w:val="false"/>
+                <w:strike w:val="false"/>
+                <w:dstrike w:val="false"/>
+                <w:outline w:val="false"/>
+                <w:shadow w:val="false"/>
+                <w:color w:val="000000"/>
+                <w:sz w:val="24"/>
+                <w:szCs w:val="24"/>
+                <w:u w:val="none"/>
+              </w:rPr>
+              <w:t>Entrada:</w:t>
+            </w:r>
+          </w:p>
+        </w:tc>
+        <w:tc>
+          <w:tcPr>
+            <w:tcW w:w="4680" w:type="dxa"/>
+            <w:tcBorders>
+              <w:left w:val="single" w:sz="4" w:space="0" w:color="000000"/>
+              <w:bottom w:val="single" w:sz="4" w:space="0" w:color="000000"/>
+              <w:right w:val="single" w:sz="4" w:space="0" w:color="000000"/>
+            </w:tcBorders>
+          </w:tcPr>
+          <w:p>
+            <w:pPr>
+              <w:pStyle w:val="Contenidodelatabla"/>
+              <w:jc w:val="left"/>
+              <w:rPr>
+                <w:rFonts w:ascii="Liberation Serif" w:hAnsi="Liberation Serif"/>
+                <w:b w:val="false"/>
+                <w:bCs w:val="false"/>
+                <w:i w:val="false"/>
+                <w:i w:val="false"/>
+                <w:iCs w:val="false"/>
+                <w:strike w:val="false"/>
+                <w:dstrike w:val="false"/>
+                <w:outline w:val="false"/>
+                <w:shadow w:val="false"/>
+                <w:color w:val="000000"/>
+                <w:sz w:val="24"/>
+                <w:szCs w:val="24"/>
+                <w:u w:val="none"/>
+              </w:rPr>
+            </w:pPr>
+            <w:r>
+              <w:rPr>
+                <w:rFonts w:ascii="Liberation Serif" w:hAnsi="Liberation Serif"/>
+                <w:b w:val="false"/>
+                <w:bCs w:val="false"/>
+                <w:i w:val="false"/>
+                <w:iCs w:val="false"/>
+                <w:strike w:val="false"/>
+                <w:dstrike w:val="false"/>
+                <w:outline w:val="false"/>
+                <w:shadow w:val="false"/>
+                <w:color w:val="000000"/>
+                <w:sz w:val="24"/>
+                <w:szCs w:val="24"/>
+                <w:u w:val="none"/>
+              </w:rPr>
+            </w:r>
+          </w:p>
+        </w:tc>
+      </w:tr>
+      <w:tr>
+        <w:trPr/>
+        <w:tc>
+          <w:tcPr>
+            <w:tcW w:w="4680" w:type="dxa"/>
+            <w:tcBorders>
+              <w:left w:val="single" w:sz="4" w:space="0" w:color="000000"/>
+              <w:bottom w:val="single" w:sz="4" w:space="0" w:color="000000"/>
+            </w:tcBorders>
+          </w:tcPr>
+          <w:p>
+            <w:pPr>
+              <w:pStyle w:val="Contenidodelatabla"/>
+              <w:jc w:val="left"/>
+              <w:rPr>
+                <w:rFonts w:ascii="Liberation Serif" w:hAnsi="Liberation Serif"/>
+                <w:b w:val="false"/>
+                <w:bCs w:val="false"/>
+                <w:i w:val="false"/>
+                <w:i w:val="false"/>
+                <w:iCs w:val="false"/>
+                <w:strike w:val="false"/>
+                <w:dstrike w:val="false"/>
+                <w:outline w:val="false"/>
+                <w:shadow w:val="false"/>
+                <w:color w:val="000000"/>
+                <w:sz w:val="24"/>
+                <w:szCs w:val="24"/>
+                <w:u w:val="none"/>
+              </w:rPr>
+            </w:pPr>
+            <w:r>
+              <w:rPr>
+                <w:rFonts w:ascii="Liberation Serif" w:hAnsi="Liberation Serif"/>
+                <w:b w:val="false"/>
+                <w:bCs w:val="false"/>
+                <w:i w:val="false"/>
+                <w:iCs w:val="false"/>
+                <w:strike w:val="false"/>
+                <w:dstrike w:val="false"/>
+                <w:outline w:val="false"/>
+                <w:shadow w:val="false"/>
+                <w:color w:val="000000"/>
+                <w:sz w:val="24"/>
+                <w:szCs w:val="24"/>
+                <w:u w:val="none"/>
+              </w:rPr>
+              <w:t>Salida:</w:t>
+            </w:r>
+          </w:p>
+        </w:tc>
+        <w:tc>
+          <w:tcPr>
+            <w:tcW w:w="4680" w:type="dxa"/>
+            <w:tcBorders>
+              <w:left w:val="single" w:sz="4" w:space="0" w:color="000000"/>
+              <w:bottom w:val="single" w:sz="4" w:space="0" w:color="000000"/>
+              <w:right w:val="single" w:sz="4" w:space="0" w:color="000000"/>
+            </w:tcBorders>
+          </w:tcPr>
+          <w:p>
+            <w:pPr>
+              <w:pStyle w:val="Contenidodelatabla"/>
+              <w:jc w:val="left"/>
+              <w:rPr>
+                <w:rFonts w:ascii="Liberation Serif" w:hAnsi="Liberation Serif"/>
+                <w:b w:val="false"/>
+                <w:bCs w:val="false"/>
+                <w:i w:val="false"/>
+                <w:i w:val="false"/>
+                <w:iCs w:val="false"/>
+                <w:strike w:val="false"/>
+                <w:dstrike w:val="false"/>
+                <w:outline w:val="false"/>
+                <w:shadow w:val="false"/>
+                <w:color w:val="000000"/>
+                <w:sz w:val="24"/>
+                <w:szCs w:val="24"/>
+                <w:u w:val="none"/>
+              </w:rPr>
+            </w:pPr>
+            <w:r>
+              <w:rPr>
+                <w:rFonts w:ascii="Liberation Serif" w:hAnsi="Liberation Serif"/>
+                <w:b w:val="false"/>
+                <w:bCs w:val="false"/>
+                <w:i w:val="false"/>
+                <w:iCs w:val="false"/>
+                <w:strike w:val="false"/>
+                <w:dstrike w:val="false"/>
+                <w:outline w:val="false"/>
+                <w:shadow w:val="false"/>
+                <w:color w:val="000000"/>
+                <w:sz w:val="24"/>
+                <w:szCs w:val="24"/>
+                <w:u w:val="none"/>
+              </w:rPr>
+            </w:r>
+          </w:p>
+        </w:tc>
+      </w:tr>
+    </w:tbl>
+    <w:p>
+      <w:pPr>
+        <w:pStyle w:val="BodyText"/>
+        <w:jc w:val="center"/>
+        <w:rPr>
+          <w:rFonts w:ascii="times new roman" w:hAnsi="times new roman"/>
+          <w:sz w:val="28"/>
+          <w:szCs w:val="28"/>
+        </w:rPr>
+      </w:pPr>
+      <w:r>
+        <w:rPr>
+          <w:rFonts w:ascii="times new roman" w:hAnsi="times new roman"/>
+          <w:sz w:val="28"/>
+          <w:szCs w:val="28"/>
+        </w:rPr>
       </w:r>
     </w:p>
     <w:p>
       <w:pPr>
         <w:pStyle w:val="Heading1"/>
+        <w:numPr>
+          <w:ilvl w:val="0"/>
+          <w:numId w:val="1"/>
+        </w:numPr>
         <w:ind w:hanging="0" w:left="0"/>
         <w:rPr/>
       </w:pPr>
@@ -1257,6 +4231,10 @@
     <w:p>
       <w:pPr>
         <w:pStyle w:val="Heading1"/>
+        <w:numPr>
+          <w:ilvl w:val="0"/>
+          <w:numId w:val="1"/>
+        </w:numPr>
         <w:ind w:hanging="0" w:left="0"/>
         <w:rPr/>
       </w:pPr>
@@ -1267,6 +4245,10 @@
     <w:p>
       <w:pPr>
         <w:pStyle w:val="Heading1"/>
+        <w:numPr>
+          <w:ilvl w:val="0"/>
+          <w:numId w:val="1"/>
+        </w:numPr>
         <w:ind w:hanging="0" w:left="0"/>
         <w:rPr/>
       </w:pPr>
@@ -1277,6 +4259,10 @@
     <w:p>
       <w:pPr>
         <w:pStyle w:val="Heading1"/>
+        <w:numPr>
+          <w:ilvl w:val="0"/>
+          <w:numId w:val="1"/>
+        </w:numPr>
         <w:ind w:hanging="0" w:left="0"/>
         <w:rPr/>
       </w:pPr>
@@ -1287,6 +4273,10 @@
     <w:p>
       <w:pPr>
         <w:pStyle w:val="Heading1"/>
+        <w:numPr>
+          <w:ilvl w:val="0"/>
+          <w:numId w:val="1"/>
+        </w:numPr>
         <w:ind w:hanging="0" w:left="0"/>
         <w:rPr/>
       </w:pPr>
@@ -1297,6 +4287,10 @@
     <w:p>
       <w:pPr>
         <w:pStyle w:val="Heading1"/>
+        <w:numPr>
+          <w:ilvl w:val="0"/>
+          <w:numId w:val="1"/>
+        </w:numPr>
         <w:ind w:hanging="0" w:left="0"/>
         <w:rPr/>
       </w:pPr>
@@ -1307,6 +4301,10 @@
     <w:p>
       <w:pPr>
         <w:pStyle w:val="Heading1"/>
+        <w:numPr>
+          <w:ilvl w:val="0"/>
+          <w:numId w:val="1"/>
+        </w:numPr>
         <w:ind w:hanging="0" w:left="0"/>
         <w:rPr/>
       </w:pPr>
@@ -1317,6 +4315,10 @@
     <w:p>
       <w:pPr>
         <w:pStyle w:val="Heading1"/>
+        <w:numPr>
+          <w:ilvl w:val="0"/>
+          <w:numId w:val="1"/>
+        </w:numPr>
         <w:ind w:hanging="0" w:left="0"/>
         <w:rPr/>
       </w:pPr>
@@ -1327,6 +4329,10 @@
     <w:p>
       <w:pPr>
         <w:pStyle w:val="Heading1"/>
+        <w:numPr>
+          <w:ilvl w:val="0"/>
+          <w:numId w:val="1"/>
+        </w:numPr>
         <w:ind w:hanging="0" w:left="0"/>
         <w:rPr/>
       </w:pPr>
@@ -1337,6 +4343,10 @@
     <w:p>
       <w:pPr>
         <w:pStyle w:val="Heading1"/>
+        <w:numPr>
+          <w:ilvl w:val="0"/>
+          <w:numId w:val="1"/>
+        </w:numPr>
         <w:ind w:hanging="0" w:left="0"/>
         <w:rPr/>
       </w:pPr>
@@ -1347,6 +4357,10 @@
     <w:p>
       <w:pPr>
         <w:pStyle w:val="Heading1"/>
+        <w:numPr>
+          <w:ilvl w:val="0"/>
+          <w:numId w:val="1"/>
+        </w:numPr>
         <w:ind w:hanging="0" w:left="0"/>
         <w:rPr/>
       </w:pPr>
@@ -1357,6 +4371,10 @@
     <w:p>
       <w:pPr>
         <w:pStyle w:val="Heading1"/>
+        <w:numPr>
+          <w:ilvl w:val="0"/>
+          <w:numId w:val="1"/>
+        </w:numPr>
         <w:ind w:hanging="0" w:left="0"/>
         <w:rPr/>
       </w:pPr>
@@ -1367,6 +4385,10 @@
     <w:p>
       <w:pPr>
         <w:pStyle w:val="Heading1"/>
+        <w:numPr>
+          <w:ilvl w:val="0"/>
+          <w:numId w:val="1"/>
+        </w:numPr>
         <w:ind w:hanging="0" w:left="0"/>
         <w:rPr/>
       </w:pPr>
@@ -1377,6 +4399,10 @@
     <w:p>
       <w:pPr>
         <w:pStyle w:val="Heading1"/>
+        <w:numPr>
+          <w:ilvl w:val="0"/>
+          <w:numId w:val="1"/>
+        </w:numPr>
         <w:ind w:hanging="0" w:left="0"/>
         <w:rPr/>
       </w:pPr>
@@ -1387,6 +4413,10 @@
     <w:p>
       <w:pPr>
         <w:pStyle w:val="Heading1"/>
+        <w:numPr>
+          <w:ilvl w:val="0"/>
+          <w:numId w:val="1"/>
+        </w:numPr>
         <w:ind w:hanging="0" w:left="0"/>
         <w:rPr/>
       </w:pPr>
@@ -1397,6 +4427,10 @@
     <w:p>
       <w:pPr>
         <w:pStyle w:val="Heading1"/>
+        <w:numPr>
+          <w:ilvl w:val="0"/>
+          <w:numId w:val="1"/>
+        </w:numPr>
         <w:ind w:hanging="0" w:left="0"/>
         <w:rPr/>
       </w:pPr>
@@ -1407,6 +4441,10 @@
     <w:p>
       <w:pPr>
         <w:pStyle w:val="Heading1"/>
+        <w:numPr>
+          <w:ilvl w:val="0"/>
+          <w:numId w:val="1"/>
+        </w:numPr>
         <w:ind w:hanging="0" w:left="0"/>
         <w:rPr/>
       </w:pPr>
@@ -1417,6 +4455,10 @@
     <w:p>
       <w:pPr>
         <w:pStyle w:val="Heading1"/>
+        <w:numPr>
+          <w:ilvl w:val="0"/>
+          <w:numId w:val="1"/>
+        </w:numPr>
         <w:ind w:hanging="0" w:left="0"/>
         <w:rPr/>
       </w:pPr>
@@ -1441,6 +4483,24 @@
     <w:p>
       <w:pPr>
         <w:pStyle w:val="Heading1"/>
+        <w:numPr>
+          <w:ilvl w:val="0"/>
+          <w:numId w:val="1"/>
+        </w:numPr>
+        <w:ind w:hanging="0" w:left="0"/>
+        <w:rPr/>
+      </w:pPr>
+      <w:r>
+        <w:rPr/>
+      </w:r>
+    </w:p>
+    <w:p>
+      <w:pPr>
+        <w:pStyle w:val="Heading1"/>
+        <w:numPr>
+          <w:ilvl w:val="0"/>
+          <w:numId w:val="1"/>
+        </w:numPr>
         <w:ind w:hanging="0" w:left="0"/>
         <w:rPr/>
       </w:pPr>
@@ -1466,7 +4526,11 @@
       </w:pPr>
       <w:r>
         <w:rPr>
-          <w:rFonts w:ascii="times new roman" w:hAnsi="times new roman"/>
+          <w:rFonts w:eastAsia="Calibri" w:cs="Calibri"/>
+          <w:color w:val="17365D"/>
+          <w:spacing w:val="5"/>
+          <w:sz w:val="52"/>
+          <w:shd w:fill="auto" w:val="clear"/>
         </w:rPr>
       </w:r>
     </w:p>
@@ -18869,7 +21933,134 @@
   <w:abstractNum w:abstractNumId="1">
     <w:lvl w:ilvl="0">
       <w:start w:val="1"/>
-      <w:pStyle w:val="Heading1"/>
+      <w:numFmt w:val="none"/>
+      <w:suff w:val="nothing"/>
+      <w:lvlText w:val=""/>
+      <w:lvlJc w:val="left"/>
+      <w:pPr>
+        <w:tabs>
+          <w:tab w:val="num" w:pos="0"/>
+        </w:tabs>
+        <w:ind w:left="0" w:hanging="0"/>
+      </w:pPr>
+      <w:rPr/>
+    </w:lvl>
+    <w:lvl w:ilvl="1">
+      <w:start w:val="1"/>
+      <w:numFmt w:val="none"/>
+      <w:suff w:val="nothing"/>
+      <w:lvlText w:val=""/>
+      <w:lvlJc w:val="left"/>
+      <w:pPr>
+        <w:tabs>
+          <w:tab w:val="num" w:pos="0"/>
+        </w:tabs>
+        <w:ind w:left="0" w:hanging="0"/>
+      </w:pPr>
+      <w:rPr/>
+    </w:lvl>
+    <w:lvl w:ilvl="2">
+      <w:start w:val="1"/>
+      <w:numFmt w:val="none"/>
+      <w:suff w:val="nothing"/>
+      <w:lvlText w:val=""/>
+      <w:lvlJc w:val="left"/>
+      <w:pPr>
+        <w:tabs>
+          <w:tab w:val="num" w:pos="0"/>
+        </w:tabs>
+        <w:ind w:left="0" w:hanging="0"/>
+      </w:pPr>
+      <w:rPr/>
+    </w:lvl>
+    <w:lvl w:ilvl="3">
+      <w:start w:val="1"/>
+      <w:numFmt w:val="none"/>
+      <w:suff w:val="nothing"/>
+      <w:lvlText w:val=""/>
+      <w:lvlJc w:val="left"/>
+      <w:pPr>
+        <w:tabs>
+          <w:tab w:val="num" w:pos="0"/>
+        </w:tabs>
+        <w:ind w:left="0" w:hanging="0"/>
+      </w:pPr>
+      <w:rPr/>
+    </w:lvl>
+    <w:lvl w:ilvl="4">
+      <w:start w:val="1"/>
+      <w:numFmt w:val="none"/>
+      <w:suff w:val="nothing"/>
+      <w:lvlText w:val=""/>
+      <w:lvlJc w:val="left"/>
+      <w:pPr>
+        <w:tabs>
+          <w:tab w:val="num" w:pos="0"/>
+        </w:tabs>
+        <w:ind w:left="0" w:hanging="0"/>
+      </w:pPr>
+      <w:rPr/>
+    </w:lvl>
+    <w:lvl w:ilvl="5">
+      <w:start w:val="1"/>
+      <w:numFmt w:val="none"/>
+      <w:suff w:val="nothing"/>
+      <w:lvlText w:val=""/>
+      <w:lvlJc w:val="left"/>
+      <w:pPr>
+        <w:tabs>
+          <w:tab w:val="num" w:pos="0"/>
+        </w:tabs>
+        <w:ind w:left="0" w:hanging="0"/>
+      </w:pPr>
+      <w:rPr/>
+    </w:lvl>
+    <w:lvl w:ilvl="6">
+      <w:start w:val="1"/>
+      <w:numFmt w:val="none"/>
+      <w:suff w:val="nothing"/>
+      <w:lvlText w:val=""/>
+      <w:lvlJc w:val="left"/>
+      <w:pPr>
+        <w:tabs>
+          <w:tab w:val="num" w:pos="0"/>
+        </w:tabs>
+        <w:ind w:left="0" w:hanging="0"/>
+      </w:pPr>
+      <w:rPr/>
+    </w:lvl>
+    <w:lvl w:ilvl="7">
+      <w:start w:val="1"/>
+      <w:numFmt w:val="none"/>
+      <w:suff w:val="nothing"/>
+      <w:lvlText w:val=""/>
+      <w:lvlJc w:val="left"/>
+      <w:pPr>
+        <w:tabs>
+          <w:tab w:val="num" w:pos="0"/>
+        </w:tabs>
+        <w:ind w:left="0" w:hanging="0"/>
+      </w:pPr>
+      <w:rPr/>
+    </w:lvl>
+    <w:lvl w:ilvl="8">
+      <w:start w:val="1"/>
+      <w:numFmt w:val="none"/>
+      <w:suff w:val="nothing"/>
+      <w:lvlText w:val=""/>
+      <w:lvlJc w:val="left"/>
+      <w:pPr>
+        <w:tabs>
+          <w:tab w:val="num" w:pos="0"/>
+        </w:tabs>
+        <w:ind w:left="0" w:hanging="0"/>
+      </w:pPr>
+      <w:rPr/>
+    </w:lvl>
+  </w:abstractNum>
+  <w:abstractNum w:abstractNumId="2">
+    <w:lvl w:ilvl="0">
+      <w:start w:val="1"/>
       <w:numFmt w:val="none"/>
       <w:suff w:val="nothing"/>
       <w:lvlText w:val=""/>
@@ -18989,6 +22180,9 @@
   <w:num w:numId="1">
     <w:abstractNumId w:val="1"/>
   </w:num>
+  <w:num w:numId="2">
+    <w:abstractNumId w:val="2"/>
+  </w:num>
 </w:numbering>
 </file>
 
@@ -19107,6 +22301,16 @@
       <w:rFonts w:cs="Noto Sans Devanagari"/>
     </w:rPr>
   </w:style>
+  <w:style w:type="paragraph" w:styleId="Contenidodelatabla">
+    <w:name w:val="Contenido de la tabla"/>
+    <w:basedOn w:val="Normal"/>
+    <w:qFormat/>
+    <w:pPr>
+      <w:widowControl w:val="false"/>
+      <w:suppressLineNumbers/>
+    </w:pPr>
+    <w:rPr/>
+  </w:style>
 </w:styles>
 </file>
 

</xml_diff>